<commit_message>
Add environment setup scripts and requirements files for project initialization
</commit_message>
<xml_diff>
--- a/Shoulder Recognition Erwin/documentation/Real Galaxy Shoulder Quantification v0.69 Documentation.docx
+++ b/Shoulder Recognition Erwin/documentation/Real Galaxy Shoulder Quantification v0.69 Documentation.docx
@@ -168,7 +168,7 @@
           </w:tcPr>
           <w:p>
             <w:r>
-              <w:t>C:\Users\gordo\Documents\Github\PythonScripts\Shoulder Recognition Erwin\Real Galaxy Shoulder Quantification v0.69.py</w:t>
+              <w:t>C:\Users\gordo\Documents\GitHub\PythonScripts\Shoulder Recognition Erwin\Real Galaxy Shoulder Quantification v0.69.py</w:t>
             </w:r>
           </w:p>
         </w:tc>
@@ -211,7 +211,7 @@
           </w:tcPr>
           <w:p>
             <w:r>
-              <w:t>2026-06-19</w:t>
+              <w:t>2026-06-25</w:t>
             </w:r>
           </w:p>
         </w:tc>
@@ -254,7 +254,7 @@
           </w:tcPr>
           <w:p>
             <w:r>
-              <w:t>High-level overview, data sources, processing workflow, outputs, parameters, and detailed code behavior.</w:t>
+              <w:t>High-level overview, data sources, processing workflow, outputs, workbook merge/format utilities, parameters, and detailed code behavior.</w:t>
             </w:r>
           </w:p>
         </w:tc>
@@ -292,7 +292,7 @@
         <w:ind w:left="540" w:hanging="271"/>
       </w:pPr>
       <w:r>
-        <w:t>Input data are external to this folder and are mostly hard-coded under the MSc research Dropbox path.</w:t>
+        <w:t>Input data are external to this folder and are selected with the --pc Laptop/Desktop switch for the two Dropbox layouts.</w:t>
       </w:r>
     </w:p>
     <w:p>
@@ -322,9 +322,501 @@
         <w:ind w:left="540" w:hanging="271"/>
       </w:pPr>
       <w:r>
-        <w:t>The script writes constructed profile caches, diagnostic plots, missing-data reports, measurement tables, and a run summary.</w:t>
+        <w:t>The script writes constructed profile caches, missing-data reports, measurement tables, a per-galaxy classification CSV, and a run summary.</w:t>
       </w:r>
     </w:p>
+    <w:p>
+      <w:pPr>
+        <w:pStyle w:val="ListBullet"/>
+        <w:spacing w:after="80" w:line="300" w:lineRule="auto"/>
+        <w:ind w:left="540" w:hanging="271"/>
+      </w:pPr>
+      <w:r>
+        <w:t>Diagnostic PNGs are not regenerated unless --write-plots is supplied.</w:t>
+      </w:r>
+    </w:p>
+    <w:p>
+      <w:pPr>
+        <w:pStyle w:val="Heading1"/>
+      </w:pPr>
+      <w:r>
+        <w:t>Updates Added 2026-06-25</w:t>
+      </w:r>
+    </w:p>
+    <w:p>
+      <w:r>
+        <w:rPr>
+          <w:b w:val="0"/>
+        </w:rPr>
+        <w:t>The shoulder-recognition workflow was extended to support the two working-machine Dropbox layouts, preserve existing plots by default, export explicit SRA classifications by galaxy, and merge those results into the PE/VPD workbook.</w:t>
+      </w:r>
+    </w:p>
+    <w:p>
+      <w:pPr>
+        <w:pStyle w:val="ListBullet"/>
+        <w:spacing w:after="80" w:line="300" w:lineRule="auto"/>
+        <w:ind w:left="540" w:hanging="271"/>
+      </w:pPr>
+      <w:r>
+        <w:t>Real Galaxy Shoulder Quantification v0.69.py now accepts --pc Laptop or --pc Desktop. Laptop maps to C:\Users\gordo\Dropbox\Public Documents\UCLAN\MSc Research; Desktop maps to D:\Dropbox\Public Documents\UCLAN\MSc Research.</w:t>
+      </w:r>
+    </w:p>
+    <w:p>
+      <w:pPr>
+        <w:pStyle w:val="ListBullet"/>
+        <w:spacing w:after="80" w:line="300" w:lineRule="auto"/>
+        <w:ind w:left="540" w:hanging="271"/>
+      </w:pPr>
+      <w:r>
+        <w:t>Diagnostic plot PNGs are skipped by default. Use --write-plots only when plots/&lt;galaxy&gt;.png should be rebuilt.</w:t>
+      </w:r>
+    </w:p>
+    <w:p>
+      <w:pPr>
+        <w:pStyle w:val="ListBullet"/>
+        <w:spacing w:after="80" w:line="300" w:lineRule="auto"/>
+        <w:ind w:left="540" w:hanging="271"/>
+      </w:pPr>
+      <w:r>
+        <w:t>The analysis now writes shoulder_classifications.csv with one row per galaxy and explicit labels: Shoulders, No Shoulders, Too Noisy, or Missing Data.</w:t>
+      </w:r>
+    </w:p>
+    <w:p>
+      <w:pPr>
+        <w:pStyle w:val="ListBullet"/>
+        <w:spacing w:after="80" w:line="300" w:lineRule="auto"/>
+        <w:ind w:left="540" w:hanging="271"/>
+      </w:pPr>
+      <w:r>
+        <w:t>Merge Shoulder Classifications Into Workbook.py updates PE_VPD_galaxy_classifications_with_definitions.xlsx from shoulder_classifications.csv and creates a timestamped workbook backup before saving.</w:t>
+      </w:r>
+    </w:p>
+    <w:p>
+      <w:pPr>
+        <w:pStyle w:val="ListBullet"/>
+        <w:spacing w:after="80" w:line="300" w:lineRule="auto"/>
+        <w:ind w:left="540" w:hanging="271"/>
+      </w:pPr>
+      <w:r>
+        <w:t>The merge utility also adds PE/VPD profile-class columns from the same classifications_pe.txt and classifications_vd_revised.txt files used by barprofiles_figures_for_paper.py.</w:t>
+      </w:r>
+    </w:p>
+    <w:p>
+      <w:pPr>
+        <w:pStyle w:val="ListBullet"/>
+        <w:spacing w:after="80" w:line="300" w:lineRule="auto"/>
+        <w:ind w:left="540" w:hanging="271"/>
+      </w:pPr>
+      <w:r>
+        <w:t>Format PE VPD Classification Workbook.py reorders the workbook so PE/VPD classifications are on the left and SRA output columns are grouped on the right. It applies bold white text on a dark-blue header background, freezes the top row, enables filters, auto-sizes columns, and creates a timestamped backup.</w:t>
+      </w:r>
+    </w:p>
+    <w:p>
+      <w:pPr>
+        <w:pStyle w:val="ListBullet"/>
+        <w:spacing w:after="80" w:line="300" w:lineRule="auto"/>
+        <w:ind w:left="540" w:hanging="271"/>
+      </w:pPr>
+      <w:r>
+        <w:t>The formatted workbook now adds an isophote profile PDF hyperlink column plus GB visual class and GB visual notes columns. The visual class column uses a dropdown with Peak+Sh, Exp, Flat-top (FT), Two-slope (2S), and Unclear.</w:t>
+      </w:r>
+    </w:p>
+    <w:p>
+      <w:pPr>
+        <w:pStyle w:val="ListBullet"/>
+        <w:spacing w:after="80" w:line="300" w:lineRule="auto"/>
+        <w:ind w:left="540" w:hanging="271"/>
+      </w:pPr>
+      <w:r>
+        <w:t>Build Bar Profile Visual Gallery.py creates a local HTML gallery for browsing the same isophote profile PDFs with PE/VPD/SRA context, visual-class dropdowns, notes, search, and CSV export from the browser.</w:t>
+      </w:r>
+    </w:p>
+    <w:p>
+      <w:pPr>
+        <w:pStyle w:val="ListBullet"/>
+        <w:spacing w:after="80" w:line="300" w:lineRule="auto"/>
+        <w:ind w:left="540" w:hanging="271"/>
+      </w:pPr>
+      <w:r>
+        <w:t>The gallery has a Reveal Classifiers toggle. When it is off, PE, VPD, and SRA labels are all hidden for every galaxy. When it is on, all three classifier labels are shown.</w:t>
+      </w:r>
+    </w:p>
+    <w:p>
+      <w:pPr>
+        <w:pStyle w:val="ListBullet"/>
+        <w:spacing w:after="80" w:line="300" w:lineRule="auto"/>
+        <w:ind w:left="540" w:hanging="271"/>
+      </w:pPr>
+      <w:r>
+        <w:t>The gallery can also be run with --serve, which starts a local server and writes GB visual class and GB visual notes changes directly back to the workbook. The Laptop launcher uses http://127.0.0.1:8899/.</w:t>
+      </w:r>
+    </w:p>
+    <w:tbl>
+      <w:tblPr>
+        <w:tblStyle w:val="TableGrid"/>
+        <w:tblW w:type="dxa" w:w="9360"/>
+        <w:tblLayout w:type="fixed"/>
+        <w:tblLook w:firstColumn="1" w:firstRow="1" w:lastColumn="0" w:lastRow="0" w:noHBand="0" w:noVBand="1" w:val="04A0"/>
+        <w:jc w:val="left"/>
+        <w:tblInd w:w="120" w:type="dxa"/>
+      </w:tblPr>
+      <w:tblGrid>
+        <w:gridCol w:w="4300"/>
+        <w:gridCol w:w="5060"/>
+      </w:tblGrid>
+      <w:tr>
+        <w:trPr>
+          <w:cantSplit/>
+          <w:tblHeader w:val="true"/>
+        </w:trPr>
+        <w:tc>
+          <w:tcPr>
+            <w:tcW w:type="dxa" w:w="4300"/>
+            <w:vAlign w:val="center"/>
+            <w:tcMar>
+              <w:top w:w="80" w:type="dxa"/>
+              <w:bottom w:w="80" w:type="dxa"/>
+              <w:start w:w="120" w:type="dxa"/>
+              <w:end w:w="120" w:type="dxa"/>
+            </w:tcMar>
+            <w:shd w:fill="E8EEF5"/>
+          </w:tcPr>
+          <w:p>
+            <w:r>
+              <w:rPr>
+                <w:b/>
+                <w:color w:val="1F4D78"/>
+              </w:rPr>
+              <w:t>Command</w:t>
+            </w:r>
+          </w:p>
+        </w:tc>
+        <w:tc>
+          <w:tcPr>
+            <w:tcW w:type="dxa" w:w="5060"/>
+            <w:vAlign w:val="center"/>
+            <w:tcMar>
+              <w:top w:w="80" w:type="dxa"/>
+              <w:bottom w:w="80" w:type="dxa"/>
+              <w:start w:w="120" w:type="dxa"/>
+              <w:end w:w="120" w:type="dxa"/>
+            </w:tcMar>
+            <w:shd w:fill="E8EEF5"/>
+          </w:tcPr>
+          <w:p>
+            <w:r>
+              <w:rPr>
+                <w:b/>
+                <w:color w:val="1F4D78"/>
+              </w:rPr>
+              <w:t>Purpose</w:t>
+            </w:r>
+          </w:p>
+        </w:tc>
+      </w:tr>
+      <w:tr>
+        <w:trPr>
+          <w:cantSplit/>
+        </w:trPr>
+        <w:tc>
+          <w:tcPr>
+            <w:tcW w:type="dxa" w:w="4300"/>
+            <w:shd w:fill="F2F4F7"/>
+            <w:vAlign w:val="center"/>
+            <w:tcMar>
+              <w:top w:w="80" w:type="dxa"/>
+              <w:bottom w:w="80" w:type="dxa"/>
+              <w:start w:w="120" w:type="dxa"/>
+              <w:end w:w="120" w:type="dxa"/>
+            </w:tcMar>
+          </w:tcPr>
+          <w:p>
+            <w:r>
+              <w:rPr>
+                <w:b/>
+              </w:rPr>
+              <w:t>python "Shoulder Recognition Erwin\Real Galaxy Shoulder Quantification v0.69.py" --pc Laptop</w:t>
+            </w:r>
+          </w:p>
+        </w:tc>
+        <w:tc>
+          <w:tcPr>
+            <w:tcW w:type="dxa" w:w="5060"/>
+            <w:vAlign w:val="center"/>
+            <w:tcMar>
+              <w:top w:w="80" w:type="dxa"/>
+              <w:bottom w:w="80" w:type="dxa"/>
+              <w:start w:w="120" w:type="dxa"/>
+              <w:end w:w="120" w:type="dxa"/>
+            </w:tcMar>
+          </w:tcPr>
+          <w:p>
+            <w:r>
+              <w:t>Run the full shoulder analysis on the Laptop Dropbox path without regenerating plot PNGs.</w:t>
+            </w:r>
+          </w:p>
+        </w:tc>
+      </w:tr>
+      <w:tr>
+        <w:trPr>
+          <w:cantSplit/>
+        </w:trPr>
+        <w:tc>
+          <w:tcPr>
+            <w:tcW w:type="dxa" w:w="4300"/>
+            <w:shd w:fill="F2F4F7"/>
+            <w:vAlign w:val="center"/>
+            <w:tcMar>
+              <w:top w:w="80" w:type="dxa"/>
+              <w:bottom w:w="80" w:type="dxa"/>
+              <w:start w:w="120" w:type="dxa"/>
+              <w:end w:w="120" w:type="dxa"/>
+            </w:tcMar>
+          </w:tcPr>
+          <w:p>
+            <w:r>
+              <w:rPr>
+                <w:b/>
+              </w:rPr>
+              <w:t>python "Shoulder Recognition Erwin\Real Galaxy Shoulder Quantification v0.69.py" --pc Desktop</w:t>
+            </w:r>
+          </w:p>
+        </w:tc>
+        <w:tc>
+          <w:tcPr>
+            <w:tcW w:type="dxa" w:w="5060"/>
+            <w:vAlign w:val="center"/>
+            <w:tcMar>
+              <w:top w:w="80" w:type="dxa"/>
+              <w:bottom w:w="80" w:type="dxa"/>
+              <w:start w:w="120" w:type="dxa"/>
+              <w:end w:w="120" w:type="dxa"/>
+            </w:tcMar>
+          </w:tcPr>
+          <w:p>
+            <w:r>
+              <w:t>Run the same analysis on the Desktop Dropbox path.</w:t>
+            </w:r>
+          </w:p>
+        </w:tc>
+      </w:tr>
+      <w:tr>
+        <w:trPr>
+          <w:cantSplit/>
+        </w:trPr>
+        <w:tc>
+          <w:tcPr>
+            <w:tcW w:type="dxa" w:w="4300"/>
+            <w:shd w:fill="F2F4F7"/>
+            <w:vAlign w:val="center"/>
+            <w:tcMar>
+              <w:top w:w="80" w:type="dxa"/>
+              <w:bottom w:w="80" w:type="dxa"/>
+              <w:start w:w="120" w:type="dxa"/>
+              <w:end w:w="120" w:type="dxa"/>
+            </w:tcMar>
+          </w:tcPr>
+          <w:p>
+            <w:r>
+              <w:rPr>
+                <w:b/>
+              </w:rPr>
+              <w:t>python "Shoulder Recognition Erwin\Real Galaxy Shoulder Quantification v0.69.py" --pc Laptop --write-plots</w:t>
+            </w:r>
+          </w:p>
+        </w:tc>
+        <w:tc>
+          <w:tcPr>
+            <w:tcW w:type="dxa" w:w="5060"/>
+            <w:vAlign w:val="center"/>
+            <w:tcMar>
+              <w:top w:w="80" w:type="dxa"/>
+              <w:bottom w:w="80" w:type="dxa"/>
+              <w:start w:w="120" w:type="dxa"/>
+              <w:end w:w="120" w:type="dxa"/>
+            </w:tcMar>
+          </w:tcPr>
+          <w:p>
+            <w:r>
+              <w:t>Run the analysis and regenerate diagnostic plot PNGs.</w:t>
+            </w:r>
+          </w:p>
+        </w:tc>
+      </w:tr>
+      <w:tr>
+        <w:trPr>
+          <w:cantSplit/>
+        </w:trPr>
+        <w:tc>
+          <w:tcPr>
+            <w:tcW w:type="dxa" w:w="4300"/>
+            <w:shd w:fill="F2F4F7"/>
+            <w:vAlign w:val="center"/>
+            <w:tcMar>
+              <w:top w:w="80" w:type="dxa"/>
+              <w:bottom w:w="80" w:type="dxa"/>
+              <w:start w:w="120" w:type="dxa"/>
+              <w:end w:w="120" w:type="dxa"/>
+            </w:tcMar>
+          </w:tcPr>
+          <w:p>
+            <w:r>
+              <w:rPr>
+                <w:b/>
+              </w:rPr>
+              <w:t>python "Shoulder Recognition Erwin\Merge Shoulder Classifications Into Workbook.py" --pc Laptop</w:t>
+            </w:r>
+          </w:p>
+        </w:tc>
+        <w:tc>
+          <w:tcPr>
+            <w:tcW w:type="dxa" w:w="5060"/>
+            <w:vAlign w:val="center"/>
+            <w:tcMar>
+              <w:top w:w="80" w:type="dxa"/>
+              <w:bottom w:w="80" w:type="dxa"/>
+              <w:start w:w="120" w:type="dxa"/>
+              <w:end w:w="120" w:type="dxa"/>
+            </w:tcMar>
+          </w:tcPr>
+          <w:p>
+            <w:r>
+              <w:t>Merge shoulder_classifications.csv plus PE/VPD profile labels into the PE/VPD workbook.</w:t>
+            </w:r>
+          </w:p>
+        </w:tc>
+      </w:tr>
+      <w:tr>
+        <w:trPr>
+          <w:cantSplit/>
+        </w:trPr>
+        <w:tc>
+          <w:tcPr>
+            <w:tcW w:type="dxa" w:w="4300"/>
+            <w:shd w:fill="F2F4F7"/>
+            <w:vAlign w:val="center"/>
+            <w:tcMar>
+              <w:top w:w="80" w:type="dxa"/>
+              <w:bottom w:w="80" w:type="dxa"/>
+              <w:start w:w="120" w:type="dxa"/>
+              <w:end w:w="120" w:type="dxa"/>
+            </w:tcMar>
+          </w:tcPr>
+          <w:p>
+            <w:r>
+              <w:rPr>
+                <w:b/>
+              </w:rPr>
+              <w:t>python "Shoulder Recognition Erwin\Format PE VPD Classification Workbook.py" --pc Laptop</w:t>
+            </w:r>
+          </w:p>
+        </w:tc>
+        <w:tc>
+          <w:tcPr>
+            <w:tcW w:type="dxa" w:w="5060"/>
+            <w:vAlign w:val="center"/>
+            <w:tcMar>
+              <w:top w:w="80" w:type="dxa"/>
+              <w:bottom w:w="80" w:type="dxa"/>
+              <w:start w:w="120" w:type="dxa"/>
+              <w:end w:w="120" w:type="dxa"/>
+            </w:tcMar>
+          </w:tcPr>
+          <w:p>
+            <w:r>
+              <w:t>Reorder and style the PE/VPD workbook after merging.</w:t>
+            </w:r>
+          </w:p>
+        </w:tc>
+      </w:tr>
+      <w:tr>
+        <w:trPr>
+          <w:cantSplit/>
+        </w:trPr>
+        <w:tc>
+          <w:tcPr>
+            <w:tcW w:type="dxa" w:w="4300"/>
+            <w:shd w:fill="F2F4F7"/>
+            <w:vAlign w:val="center"/>
+            <w:tcMar>
+              <w:top w:w="80" w:type="dxa"/>
+              <w:bottom w:w="80" w:type="dxa"/>
+              <w:start w:w="120" w:type="dxa"/>
+              <w:end w:w="120" w:type="dxa"/>
+            </w:tcMar>
+          </w:tcPr>
+          <w:p>
+            <w:r>
+              <w:rPr>
+                <w:b/>
+              </w:rPr>
+              <w:t>python "Shoulder Recognition Erwin\Build Bar Profile Visual Gallery.py" --pc Laptop</w:t>
+            </w:r>
+          </w:p>
+        </w:tc>
+        <w:tc>
+          <w:tcPr>
+            <w:tcW w:type="dxa" w:w="5060"/>
+            <w:vAlign w:val="center"/>
+            <w:tcMar>
+              <w:top w:w="80" w:type="dxa"/>
+              <w:bottom w:w="80" w:type="dxa"/>
+              <w:start w:w="120" w:type="dxa"/>
+              <w:end w:w="120" w:type="dxa"/>
+            </w:tcMar>
+          </w:tcPr>
+          <w:p>
+            <w:r>
+              <w:t>Build the local HTML gallery for visual review of isophote profile PDFs.</w:t>
+            </w:r>
+          </w:p>
+        </w:tc>
+      </w:tr>
+      <w:tr>
+        <w:trPr>
+          <w:cantSplit/>
+        </w:trPr>
+        <w:tc>
+          <w:tcPr>
+            <w:tcW w:type="dxa" w:w="4300"/>
+            <w:shd w:fill="F2F4F7"/>
+            <w:vAlign w:val="center"/>
+            <w:tcMar>
+              <w:top w:w="80" w:type="dxa"/>
+              <w:bottom w:w="80" w:type="dxa"/>
+              <w:start w:w="120" w:type="dxa"/>
+              <w:end w:w="120" w:type="dxa"/>
+            </w:tcMar>
+          </w:tcPr>
+          <w:p>
+            <w:r>
+              <w:rPr>
+                <w:b/>
+              </w:rPr>
+              <w:t>python "Shoulder Recognition Erwin\Build Bar Profile Visual Gallery.py" --pc Laptop --serve --port 8899</w:t>
+            </w:r>
+          </w:p>
+        </w:tc>
+        <w:tc>
+          <w:tcPr>
+            <w:tcW w:type="dxa" w:w="5060"/>
+            <w:vAlign w:val="center"/>
+            <w:tcMar>
+              <w:top w:w="80" w:type="dxa"/>
+              <w:bottom w:w="80" w:type="dxa"/>
+              <w:start w:w="120" w:type="dxa"/>
+              <w:end w:w="120" w:type="dxa"/>
+            </w:tcMar>
+          </w:tcPr>
+          <w:p>
+            <w:r>
+              <w:t>Run the workbook-writing local gallery server at http://127.0.0.1:8899/.</w:t>
+            </w:r>
+          </w:p>
+        </w:tc>
+      </w:tr>
+    </w:tbl>
+    <w:p/>
     <w:p>
       <w:pPr>
         <w:pStyle w:val="Heading1"/>
@@ -528,7 +1020,7 @@
           </w:tcPr>
           <w:p>
             <w:r>
-              <w:t>Loads 3.6 micron images from each manifest image_path or from D:\Dropbox\Public Documents\UCLAN\MSc Research\Erwin\s4g_images_36um\&lt;galaxy&gt;.phot.1.fits.</w:t>
+              <w:t>Loads 3.6 micron images from each manifest image_path or from &lt;research_folder&gt;\Erwin\s4g_images_36um\&lt;galaxy&gt;.phot.1.fits.</w:t>
             </w:r>
           </w:p>
         </w:tc>
@@ -713,7 +1205,50 @@
               <w:rPr>
                 <w:b/>
               </w:rPr>
-              <w:t>research_folder</w:t>
+              <w:t>--pc Laptop</w:t>
+            </w:r>
+          </w:p>
+        </w:tc>
+        <w:tc>
+          <w:tcPr>
+            <w:tcW w:type="dxa" w:w="6960"/>
+            <w:vAlign w:val="center"/>
+            <w:tcMar>
+              <w:top w:w="80" w:type="dxa"/>
+              <w:bottom w:w="80" w:type="dxa"/>
+              <w:start w:w="120" w:type="dxa"/>
+              <w:end w:w="120" w:type="dxa"/>
+            </w:tcMar>
+          </w:tcPr>
+          <w:p>
+            <w:r>
+              <w:t>C:\Users\gordo\Dropbox\Public Documents\UCLAN\MSc Research</w:t>
+            </w:r>
+          </w:p>
+        </w:tc>
+      </w:tr>
+      <w:tr>
+        <w:trPr>
+          <w:cantSplit/>
+        </w:trPr>
+        <w:tc>
+          <w:tcPr>
+            <w:tcW w:type="dxa" w:w="2400"/>
+            <w:shd w:fill="F2F4F7"/>
+            <w:vAlign w:val="center"/>
+            <w:tcMar>
+              <w:top w:w="80" w:type="dxa"/>
+              <w:bottom w:w="80" w:type="dxa"/>
+              <w:start w:w="120" w:type="dxa"/>
+              <w:end w:w="120" w:type="dxa"/>
+            </w:tcMar>
+          </w:tcPr>
+          <w:p>
+            <w:r>
+              <w:rPr>
+                <w:b/>
+              </w:rPr>
+              <w:t>--pc Desktop</w:t>
             </w:r>
           </w:p>
         </w:tc>
@@ -1036,6 +1571,49 @@
           </w:p>
         </w:tc>
       </w:tr>
+      <w:tr>
+        <w:trPr>
+          <w:cantSplit/>
+        </w:trPr>
+        <w:tc>
+          <w:tcPr>
+            <w:tcW w:type="dxa" w:w="2400"/>
+            <w:shd w:fill="F2F4F7"/>
+            <w:vAlign w:val="center"/>
+            <w:tcMar>
+              <w:top w:w="80" w:type="dxa"/>
+              <w:bottom w:w="80" w:type="dxa"/>
+              <w:start w:w="120" w:type="dxa"/>
+              <w:end w:w="120" w:type="dxa"/>
+            </w:tcMar>
+          </w:tcPr>
+          <w:p>
+            <w:r>
+              <w:rPr>
+                <w:b/>
+              </w:rPr>
+              <w:t>workbook</w:t>
+            </w:r>
+          </w:p>
+        </w:tc>
+        <w:tc>
+          <w:tcPr>
+            <w:tcW w:type="dxa" w:w="6960"/>
+            <w:vAlign w:val="center"/>
+            <w:tcMar>
+              <w:top w:w="80" w:type="dxa"/>
+              <w:bottom w:w="80" w:type="dxa"/>
+              <w:start w:w="120" w:type="dxa"/>
+              <w:end w:w="120" w:type="dxa"/>
+            </w:tcMar>
+          </w:tcPr>
+          <w:p>
+            <w:r>
+              <w:t>&lt;output_folder&gt;\PE_VPD_galaxy_classifications_with_definitions.xlsx</w:t>
+            </w:r>
+          </w:p>
+        </w:tc>
+      </w:tr>
     </w:tbl>
     <w:p/>
     <w:p>
@@ -1123,7 +1701,17 @@
         <w:ind w:left="540" w:hanging="271"/>
       </w:pPr>
       <w:r>
-        <w:t>Save one diagnostic PNG per analysed galaxy and write the final shoulder measurements in NPY and CSV formats plus a plain-text run summary.</w:t>
+        <w:t>Write final shoulder measurements in NPY and CSV formats, write shoulder_classifications.csv, and write a plain-text run summary.</w:t>
+      </w:r>
+    </w:p>
+    <w:p>
+      <w:pPr>
+        <w:pStyle w:val="ListNumber"/>
+        <w:spacing w:after="80" w:line="300" w:lineRule="auto"/>
+        <w:ind w:left="540" w:hanging="271"/>
+      </w:pPr>
+      <w:r>
+        <w:t>Optionally save one diagnostic PNG per analysed galaxy when --write-plots is supplied.</w:t>
       </w:r>
     </w:p>
     <w:p>
@@ -2100,6 +2688,49 @@
               <w:rPr>
                 <w:b/>
               </w:rPr>
+              <w:t>shoulder_classifications.csv</w:t>
+            </w:r>
+          </w:p>
+        </w:tc>
+        <w:tc>
+          <w:tcPr>
+            <w:tcW w:type="dxa" w:w="6260"/>
+            <w:vAlign w:val="center"/>
+            <w:tcMar>
+              <w:top w:w="80" w:type="dxa"/>
+              <w:bottom w:w="80" w:type="dxa"/>
+              <w:start w:w="120" w:type="dxa"/>
+              <w:end w:w="120" w:type="dxa"/>
+            </w:tcMar>
+          </w:tcPr>
+          <w:p>
+            <w:r>
+              <w:t>Per-galaxy SRA classification table with sra_classification, detail text, left/right shoulder flags, failed_extrema, d_extrema, d2_extrema, and roc_minima.</w:t>
+            </w:r>
+          </w:p>
+        </w:tc>
+      </w:tr>
+      <w:tr>
+        <w:trPr>
+          <w:cantSplit/>
+        </w:trPr>
+        <w:tc>
+          <w:tcPr>
+            <w:tcW w:type="dxa" w:w="3100"/>
+            <w:shd w:fill="F2F4F7"/>
+            <w:vAlign w:val="center"/>
+            <w:tcMar>
+              <w:top w:w="80" w:type="dxa"/>
+              <w:bottom w:w="80" w:type="dxa"/>
+              <w:start w:w="120" w:type="dxa"/>
+              <w:end w:w="120" w:type="dxa"/>
+            </w:tcMar>
+          </w:tcPr>
+          <w:p>
+            <w:r>
+              <w:rPr>
+                <w:b/>
+              </w:rPr>
               <w:t>run_summary.txt</w:t>
             </w:r>
           </w:p>
@@ -2118,6 +2749,92 @@
           <w:p>
             <w:r>
               <w:t>Run-level summary of classified galaxies, usable galaxies, skipped galaxies, shoulder systems found, and output locations.</w:t>
+            </w:r>
+          </w:p>
+        </w:tc>
+      </w:tr>
+      <w:tr>
+        <w:trPr>
+          <w:cantSplit/>
+        </w:trPr>
+        <w:tc>
+          <w:tcPr>
+            <w:tcW w:type="dxa" w:w="3100"/>
+            <w:shd w:fill="F2F4F7"/>
+            <w:vAlign w:val="center"/>
+            <w:tcMar>
+              <w:top w:w="80" w:type="dxa"/>
+              <w:bottom w:w="80" w:type="dxa"/>
+              <w:start w:w="120" w:type="dxa"/>
+              <w:end w:w="120" w:type="dxa"/>
+            </w:tcMar>
+          </w:tcPr>
+          <w:p>
+            <w:r>
+              <w:rPr>
+                <w:b/>
+              </w:rPr>
+              <w:t>PE_VPD_galaxy_classifications_with_definitions.xlsx</w:t>
+            </w:r>
+          </w:p>
+        </w:tc>
+        <w:tc>
+          <w:tcPr>
+            <w:tcW w:type="dxa" w:w="6260"/>
+            <w:vAlign w:val="center"/>
+            <w:tcMar>
+              <w:top w:w="80" w:type="dxa"/>
+              <w:bottom w:w="80" w:type="dxa"/>
+              <w:start w:w="120" w:type="dxa"/>
+              <w:end w:w="120" w:type="dxa"/>
+            </w:tcMar>
+          </w:tcPr>
+          <w:p>
+            <w:r>
+              <w:t>Workbook updated by the merge and formatter scripts. The Classifications sheet keeps isophote PDF links and manual GB visual-review columns near the galaxy name, PE/VPD profile classifications on the left, and SRA output columns on the right.</w:t>
+            </w:r>
+          </w:p>
+        </w:tc>
+      </w:tr>
+      <w:tr>
+        <w:trPr>
+          <w:cantSplit/>
+        </w:trPr>
+        <w:tc>
+          <w:tcPr>
+            <w:tcW w:type="dxa" w:w="3100"/>
+            <w:shd w:fill="F2F4F7"/>
+            <w:vAlign w:val="center"/>
+            <w:tcMar>
+              <w:top w:w="80" w:type="dxa"/>
+              <w:bottom w:w="80" w:type="dxa"/>
+              <w:start w:w="120" w:type="dxa"/>
+              <w:end w:w="120" w:type="dxa"/>
+            </w:tcMar>
+          </w:tcPr>
+          <w:p>
+            <w:r>
+              <w:rPr>
+                <w:b/>
+              </w:rPr>
+              <w:t>bar_profile_visual_gallery.html</w:t>
+            </w:r>
+          </w:p>
+        </w:tc>
+        <w:tc>
+          <w:tcPr>
+            <w:tcW w:type="dxa" w:w="6260"/>
+            <w:vAlign w:val="center"/>
+            <w:tcMar>
+              <w:top w:w="80" w:type="dxa"/>
+              <w:bottom w:w="80" w:type="dxa"/>
+              <w:start w:w="120" w:type="dxa"/>
+              <w:end w:w="120" w:type="dxa"/>
+            </w:tcMar>
+          </w:tcPr>
+          <w:p>
+            <w:r>
+              <w:t>Local HTML gallery for browsing the isophote profile PDFs with PE/VPD/SRA context, hiding or revealing those classifier labels with the Reveal Classifiers toggle, saving browser-local visual classes and notes, and exporting those visual classifications to CSV.</w:t>
             </w:r>
           </w:p>
         </w:tc>
@@ -2492,6 +3209,1021 @@
           <w:p>
             <w:r>
               <w:t>Radius-of-curvature minima bracketing the right clavicle.</w:t>
+            </w:r>
+          </w:p>
+        </w:tc>
+      </w:tr>
+    </w:tbl>
+    <w:p/>
+    <w:p>
+      <w:pPr>
+        <w:pStyle w:val="Heading2"/>
+      </w:pPr>
+      <w:r>
+        <w:t>Classification CSV columns</w:t>
+      </w:r>
+    </w:p>
+    <w:tbl>
+      <w:tblPr>
+        <w:tblStyle w:val="TableGrid"/>
+        <w:tblW w:type="dxa" w:w="9360"/>
+        <w:tblLayout w:type="fixed"/>
+        <w:tblLook w:firstColumn="1" w:firstRow="1" w:lastColumn="0" w:lastRow="0" w:noHBand="0" w:noVBand="1" w:val="04A0"/>
+        <w:jc w:val="left"/>
+        <w:tblInd w:w="120" w:type="dxa"/>
+      </w:tblPr>
+      <w:tblGrid>
+        <w:gridCol w:w="3000"/>
+        <w:gridCol w:w="6360"/>
+      </w:tblGrid>
+      <w:tr>
+        <w:trPr>
+          <w:cantSplit/>
+          <w:tblHeader w:val="true"/>
+        </w:trPr>
+        <w:tc>
+          <w:tcPr>
+            <w:tcW w:type="dxa" w:w="3000"/>
+            <w:vAlign w:val="center"/>
+            <w:tcMar>
+              <w:top w:w="80" w:type="dxa"/>
+              <w:bottom w:w="80" w:type="dxa"/>
+              <w:start w:w="120" w:type="dxa"/>
+              <w:end w:w="120" w:type="dxa"/>
+            </w:tcMar>
+            <w:shd w:fill="E8EEF5"/>
+          </w:tcPr>
+          <w:p>
+            <w:r>
+              <w:rPr>
+                <w:b/>
+                <w:color w:val="1F4D78"/>
+              </w:rPr>
+              <w:t>Column</w:t>
+            </w:r>
+          </w:p>
+        </w:tc>
+        <w:tc>
+          <w:tcPr>
+            <w:tcW w:type="dxa" w:w="6360"/>
+            <w:vAlign w:val="center"/>
+            <w:tcMar>
+              <w:top w:w="80" w:type="dxa"/>
+              <w:bottom w:w="80" w:type="dxa"/>
+              <w:start w:w="120" w:type="dxa"/>
+              <w:end w:w="120" w:type="dxa"/>
+            </w:tcMar>
+            <w:shd w:fill="E8EEF5"/>
+          </w:tcPr>
+          <w:p>
+            <w:r>
+              <w:rPr>
+                <w:b/>
+                <w:color w:val="1F4D78"/>
+              </w:rPr>
+              <w:t>Meaning</w:t>
+            </w:r>
+          </w:p>
+        </w:tc>
+      </w:tr>
+      <w:tr>
+        <w:trPr>
+          <w:cantSplit/>
+        </w:trPr>
+        <w:tc>
+          <w:tcPr>
+            <w:tcW w:type="dxa" w:w="3000"/>
+            <w:shd w:fill="F2F4F7"/>
+            <w:vAlign w:val="center"/>
+            <w:tcMar>
+              <w:top w:w="80" w:type="dxa"/>
+              <w:bottom w:w="80" w:type="dxa"/>
+              <w:start w:w="120" w:type="dxa"/>
+              <w:end w:w="120" w:type="dxa"/>
+            </w:tcMar>
+          </w:tcPr>
+          <w:p>
+            <w:r>
+              <w:rPr>
+                <w:b/>
+              </w:rPr>
+              <w:t>galaxy</w:t>
+            </w:r>
+          </w:p>
+        </w:tc>
+        <w:tc>
+          <w:tcPr>
+            <w:tcW w:type="dxa" w:w="6360"/>
+            <w:vAlign w:val="center"/>
+            <w:tcMar>
+              <w:top w:w="80" w:type="dxa"/>
+              <w:bottom w:w="80" w:type="dxa"/>
+              <w:start w:w="120" w:type="dxa"/>
+              <w:end w:w="120" w:type="dxa"/>
+            </w:tcMar>
+          </w:tcPr>
+          <w:p>
+            <w:r>
+              <w:t>Galaxy name.</w:t>
+            </w:r>
+          </w:p>
+        </w:tc>
+      </w:tr>
+      <w:tr>
+        <w:trPr>
+          <w:cantSplit/>
+        </w:trPr>
+        <w:tc>
+          <w:tcPr>
+            <w:tcW w:type="dxa" w:w="3000"/>
+            <w:shd w:fill="F2F4F7"/>
+            <w:vAlign w:val="center"/>
+            <w:tcMar>
+              <w:top w:w="80" w:type="dxa"/>
+              <w:bottom w:w="80" w:type="dxa"/>
+              <w:start w:w="120" w:type="dxa"/>
+              <w:end w:w="120" w:type="dxa"/>
+            </w:tcMar>
+          </w:tcPr>
+          <w:p>
+            <w:r>
+              <w:rPr>
+                <w:b/>
+              </w:rPr>
+              <w:t>sra_classification</w:t>
+            </w:r>
+          </w:p>
+        </w:tc>
+        <w:tc>
+          <w:tcPr>
+            <w:tcW w:type="dxa" w:w="6360"/>
+            <w:vAlign w:val="center"/>
+            <w:tcMar>
+              <w:top w:w="80" w:type="dxa"/>
+              <w:bottom w:w="80" w:type="dxa"/>
+              <w:start w:w="120" w:type="dxa"/>
+              <w:end w:w="120" w:type="dxa"/>
+            </w:tcMar>
+          </w:tcPr>
+          <w:p>
+            <w:r>
+              <w:t>Final SRA label: Shoulders, No Shoulders, Too Noisy, or Missing Data.</w:t>
+            </w:r>
+          </w:p>
+        </w:tc>
+      </w:tr>
+      <w:tr>
+        <w:trPr>
+          <w:cantSplit/>
+        </w:trPr>
+        <w:tc>
+          <w:tcPr>
+            <w:tcW w:type="dxa" w:w="3000"/>
+            <w:shd w:fill="F2F4F7"/>
+            <w:vAlign w:val="center"/>
+            <w:tcMar>
+              <w:top w:w="80" w:type="dxa"/>
+              <w:bottom w:w="80" w:type="dxa"/>
+              <w:start w:w="120" w:type="dxa"/>
+              <w:end w:w="120" w:type="dxa"/>
+            </w:tcMar>
+          </w:tcPr>
+          <w:p>
+            <w:r>
+              <w:rPr>
+                <w:b/>
+              </w:rPr>
+              <w:t>sra_classification_detail</w:t>
+            </w:r>
+          </w:p>
+        </w:tc>
+        <w:tc>
+          <w:tcPr>
+            <w:tcW w:type="dxa" w:w="6360"/>
+            <w:vAlign w:val="center"/>
+            <w:tcMar>
+              <w:top w:w="80" w:type="dxa"/>
+              <w:bottom w:w="80" w:type="dxa"/>
+              <w:start w:w="120" w:type="dxa"/>
+              <w:end w:w="120" w:type="dxa"/>
+            </w:tcMar>
+          </w:tcPr>
+          <w:p>
+            <w:r>
+              <w:t>Short explanation for the SRA label, such as accepted left and right shoulders, too many extrema, no accepted shoulder pair, or missing-data reason.</w:t>
+            </w:r>
+          </w:p>
+        </w:tc>
+      </w:tr>
+      <w:tr>
+        <w:trPr>
+          <w:cantSplit/>
+        </w:trPr>
+        <w:tc>
+          <w:tcPr>
+            <w:tcW w:type="dxa" w:w="3000"/>
+            <w:shd w:fill="F2F4F7"/>
+            <w:vAlign w:val="center"/>
+            <w:tcMar>
+              <w:top w:w="80" w:type="dxa"/>
+              <w:bottom w:w="80" w:type="dxa"/>
+              <w:start w:w="120" w:type="dxa"/>
+              <w:end w:w="120" w:type="dxa"/>
+            </w:tcMar>
+          </w:tcPr>
+          <w:p>
+            <w:r>
+              <w:rPr>
+                <w:b/>
+              </w:rPr>
+              <w:t>left_shoulder_found / right_shoulder_found</w:t>
+            </w:r>
+          </w:p>
+        </w:tc>
+        <w:tc>
+          <w:tcPr>
+            <w:tcW w:type="dxa" w:w="6360"/>
+            <w:vAlign w:val="center"/>
+            <w:tcMar>
+              <w:top w:w="80" w:type="dxa"/>
+              <w:bottom w:w="80" w:type="dxa"/>
+              <w:start w:w="120" w:type="dxa"/>
+              <w:end w:w="120" w:type="dxa"/>
+            </w:tcMar>
+          </w:tcPr>
+          <w:p>
+            <w:r>
+              <w:t>Boolean flags showing whether each side survived the candidate filters.</w:t>
+            </w:r>
+          </w:p>
+        </w:tc>
+      </w:tr>
+      <w:tr>
+        <w:trPr>
+          <w:cantSplit/>
+        </w:trPr>
+        <w:tc>
+          <w:tcPr>
+            <w:tcW w:type="dxa" w:w="3000"/>
+            <w:shd w:fill="F2F4F7"/>
+            <w:vAlign w:val="center"/>
+            <w:tcMar>
+              <w:top w:w="80" w:type="dxa"/>
+              <w:bottom w:w="80" w:type="dxa"/>
+              <w:start w:w="120" w:type="dxa"/>
+              <w:end w:w="120" w:type="dxa"/>
+            </w:tcMar>
+          </w:tcPr>
+          <w:p>
+            <w:r>
+              <w:rPr>
+                <w:b/>
+              </w:rPr>
+              <w:t>failed_extrema</w:t>
+            </w:r>
+          </w:p>
+        </w:tc>
+        <w:tc>
+          <w:tcPr>
+            <w:tcW w:type="dxa" w:w="6360"/>
+            <w:vAlign w:val="center"/>
+            <w:tcMar>
+              <w:top w:w="80" w:type="dxa"/>
+              <w:bottom w:w="80" w:type="dxa"/>
+              <w:start w:w="120" w:type="dxa"/>
+              <w:end w:w="120" w:type="dxa"/>
+            </w:tcMar>
+          </w:tcPr>
+          <w:p>
+            <w:r>
+              <w:t>True when the profile was rejected as too noisy because first-derivative extrema exceeded peaks_max.</w:t>
+            </w:r>
+          </w:p>
+        </w:tc>
+      </w:tr>
+      <w:tr>
+        <w:trPr>
+          <w:cantSplit/>
+        </w:trPr>
+        <w:tc>
+          <w:tcPr>
+            <w:tcW w:type="dxa" w:w="3000"/>
+            <w:shd w:fill="F2F4F7"/>
+            <w:vAlign w:val="center"/>
+            <w:tcMar>
+              <w:top w:w="80" w:type="dxa"/>
+              <w:bottom w:w="80" w:type="dxa"/>
+              <w:start w:w="120" w:type="dxa"/>
+              <w:end w:w="120" w:type="dxa"/>
+            </w:tcMar>
+          </w:tcPr>
+          <w:p>
+            <w:r>
+              <w:rPr>
+                <w:b/>
+              </w:rPr>
+              <w:t>d_extrema / d2_extrema / roc_minima</w:t>
+            </w:r>
+          </w:p>
+        </w:tc>
+        <w:tc>
+          <w:tcPr>
+            <w:tcW w:type="dxa" w:w="6360"/>
+            <w:vAlign w:val="center"/>
+            <w:tcMar>
+              <w:top w:w="80" w:type="dxa"/>
+              <w:bottom w:w="80" w:type="dxa"/>
+              <w:start w:w="120" w:type="dxa"/>
+              <w:end w:w="120" w:type="dxa"/>
+            </w:tcMar>
+          </w:tcPr>
+          <w:p>
+            <w:r>
+              <w:t>Diagnostic counts used in the plot annotations and classification detail.</w:t>
+            </w:r>
+          </w:p>
+        </w:tc>
+      </w:tr>
+    </w:tbl>
+    <w:p/>
+    <w:p>
+      <w:pPr>
+        <w:pStyle w:val="Heading1"/>
+      </w:pPr>
+      <w:r>
+        <w:t>Workbook Merge and Formatting Utilities</w:t>
+      </w:r>
+    </w:p>
+    <w:p>
+      <w:r>
+        <w:rPr>
+          <w:b w:val="0"/>
+        </w:rPr>
+        <w:t>Companion scripts maintain PE_VPD_galaxy_classifications_with_definitions.xlsx after the SRA run and provide a separate HTML visual-review option. They are separate from the scientific analysis so the workbook and review gallery can be refreshed or restyled without regenerating profiles or plots.</w:t>
+      </w:r>
+    </w:p>
+    <w:tbl>
+      <w:tblPr>
+        <w:tblStyle w:val="TableGrid"/>
+        <w:tblW w:type="dxa" w:w="9360"/>
+        <w:tblLayout w:type="fixed"/>
+        <w:tblLook w:firstColumn="1" w:firstRow="1" w:lastColumn="0" w:lastRow="0" w:noHBand="0" w:noVBand="1" w:val="04A0"/>
+        <w:jc w:val="left"/>
+        <w:tblInd w:w="120" w:type="dxa"/>
+      </w:tblPr>
+      <w:tblGrid>
+        <w:gridCol w:w="3200"/>
+        <w:gridCol w:w="6160"/>
+      </w:tblGrid>
+      <w:tr>
+        <w:trPr>
+          <w:cantSplit/>
+          <w:tblHeader w:val="true"/>
+        </w:trPr>
+        <w:tc>
+          <w:tcPr>
+            <w:tcW w:type="dxa" w:w="3200"/>
+            <w:vAlign w:val="center"/>
+            <w:tcMar>
+              <w:top w:w="80" w:type="dxa"/>
+              <w:bottom w:w="80" w:type="dxa"/>
+              <w:start w:w="120" w:type="dxa"/>
+              <w:end w:w="120" w:type="dxa"/>
+            </w:tcMar>
+            <w:shd w:fill="E8EEF5"/>
+          </w:tcPr>
+          <w:p>
+            <w:r>
+              <w:rPr>
+                <w:b/>
+                <w:color w:val="1F4D78"/>
+              </w:rPr>
+              <w:t>Script</w:t>
+            </w:r>
+          </w:p>
+        </w:tc>
+        <w:tc>
+          <w:tcPr>
+            <w:tcW w:type="dxa" w:w="6160"/>
+            <w:vAlign w:val="center"/>
+            <w:tcMar>
+              <w:top w:w="80" w:type="dxa"/>
+              <w:bottom w:w="80" w:type="dxa"/>
+              <w:start w:w="120" w:type="dxa"/>
+              <w:end w:w="120" w:type="dxa"/>
+            </w:tcMar>
+            <w:shd w:fill="E8EEF5"/>
+          </w:tcPr>
+          <w:p>
+            <w:r>
+              <w:rPr>
+                <w:b/>
+                <w:color w:val="1F4D78"/>
+              </w:rPr>
+              <w:t>Behavior</w:t>
+            </w:r>
+          </w:p>
+        </w:tc>
+      </w:tr>
+      <w:tr>
+        <w:trPr>
+          <w:cantSplit/>
+        </w:trPr>
+        <w:tc>
+          <w:tcPr>
+            <w:tcW w:type="dxa" w:w="3200"/>
+            <w:shd w:fill="F2F4F7"/>
+            <w:vAlign w:val="center"/>
+            <w:tcMar>
+              <w:top w:w="80" w:type="dxa"/>
+              <w:bottom w:w="80" w:type="dxa"/>
+              <w:start w:w="120" w:type="dxa"/>
+              <w:end w:w="120" w:type="dxa"/>
+            </w:tcMar>
+          </w:tcPr>
+          <w:p>
+            <w:r>
+              <w:rPr>
+                <w:b/>
+              </w:rPr>
+              <w:t>Merge Shoulder Classifications Into Workbook.py</w:t>
+            </w:r>
+          </w:p>
+        </w:tc>
+        <w:tc>
+          <w:tcPr>
+            <w:tcW w:type="dxa" w:w="6160"/>
+            <w:vAlign w:val="center"/>
+            <w:tcMar>
+              <w:top w:w="80" w:type="dxa"/>
+              <w:bottom w:w="80" w:type="dxa"/>
+              <w:start w:w="120" w:type="dxa"/>
+              <w:end w:w="120" w:type="dxa"/>
+            </w:tcMar>
+          </w:tcPr>
+          <w:p>
+            <w:r>
+              <w:t>Reads shoulder_classifications.csv and updates the Classifications sheet. It also reads the PE and VPD bar-profile classification files, maps raw codes to display labels, writes profile-definition rows to the Definitions sheet, and creates a timestamped backup before saving.</w:t>
+            </w:r>
+          </w:p>
+        </w:tc>
+      </w:tr>
+      <w:tr>
+        <w:trPr>
+          <w:cantSplit/>
+        </w:trPr>
+        <w:tc>
+          <w:tcPr>
+            <w:tcW w:type="dxa" w:w="3200"/>
+            <w:shd w:fill="F2F4F7"/>
+            <w:vAlign w:val="center"/>
+            <w:tcMar>
+              <w:top w:w="80" w:type="dxa"/>
+              <w:bottom w:w="80" w:type="dxa"/>
+              <w:start w:w="120" w:type="dxa"/>
+              <w:end w:w="120" w:type="dxa"/>
+            </w:tcMar>
+          </w:tcPr>
+          <w:p>
+            <w:r>
+              <w:rPr>
+                <w:b/>
+              </w:rPr>
+              <w:t>Format PE VPD Classification Workbook.py</w:t>
+            </w:r>
+          </w:p>
+        </w:tc>
+        <w:tc>
+          <w:tcPr>
+            <w:tcW w:type="dxa" w:w="6160"/>
+            <w:vAlign w:val="center"/>
+            <w:tcMar>
+              <w:top w:w="80" w:type="dxa"/>
+              <w:bottom w:w="80" w:type="dxa"/>
+              <w:start w:w="120" w:type="dxa"/>
+              <w:end w:w="120" w:type="dxa"/>
+            </w:tcMar>
+          </w:tcPr>
+          <w:p>
+            <w:r>
+              <w:t>Reorders the Classifications sheet so galaxy, isophote PDF links, and manual GB visual-review columns are leftmost, PE/VPD columns follow, and SRA columns are grouped to the right. It applies bold white text on dark-blue headers, freezes the top row, enables filters, auto-sizes columns, styles the Definitions headers, and creates a timestamped backup before saving.</w:t>
+            </w:r>
+          </w:p>
+        </w:tc>
+      </w:tr>
+      <w:tr>
+        <w:trPr>
+          <w:cantSplit/>
+        </w:trPr>
+        <w:tc>
+          <w:tcPr>
+            <w:tcW w:type="dxa" w:w="3200"/>
+            <w:shd w:fill="F2F4F7"/>
+            <w:vAlign w:val="center"/>
+            <w:tcMar>
+              <w:top w:w="80" w:type="dxa"/>
+              <w:bottom w:w="80" w:type="dxa"/>
+              <w:start w:w="120" w:type="dxa"/>
+              <w:end w:w="120" w:type="dxa"/>
+            </w:tcMar>
+          </w:tcPr>
+          <w:p>
+            <w:r>
+              <w:rPr>
+                <w:b/>
+              </w:rPr>
+              <w:t>Build Bar Profile Visual Gallery.py</w:t>
+            </w:r>
+          </w:p>
+        </w:tc>
+        <w:tc>
+          <w:tcPr>
+            <w:tcW w:type="dxa" w:w="6160"/>
+            <w:vAlign w:val="center"/>
+            <w:tcMar>
+              <w:top w:w="80" w:type="dxa"/>
+              <w:bottom w:w="80" w:type="dxa"/>
+              <w:start w:w="120" w:type="dxa"/>
+              <w:end w:w="120" w:type="dxa"/>
+            </w:tcMar>
+          </w:tcPr>
+          <w:p>
+            <w:r>
+              <w:t>Reads the Classifications sheet and the individual isophote profile PDF folder, then writes bar_profile_visual_gallery.html with one card per galaxy, embedded PDF previews, current PE/VPD/SRA context, browser-local visual class/notes fields, search, CSV export, and a Reveal Classifiers toggle that hides or shows PE, VPD, and SRA together. With --serve it starts a local server that writes visual classes and notes directly back to the workbook.</w:t>
+            </w:r>
+          </w:p>
+        </w:tc>
+      </w:tr>
+    </w:tbl>
+    <w:p/>
+    <w:tbl>
+      <w:tblPr>
+        <w:tblStyle w:val="TableGrid"/>
+        <w:tblW w:type="dxa" w:w="9360"/>
+        <w:tblLayout w:type="fixed"/>
+        <w:tblLook w:firstColumn="1" w:firstRow="1" w:lastColumn="0" w:lastRow="0" w:noHBand="0" w:noVBand="1" w:val="04A0"/>
+        <w:jc w:val="left"/>
+        <w:tblInd w:w="120" w:type="dxa"/>
+      </w:tblPr>
+      <w:tblGrid>
+        <w:gridCol w:w="3000"/>
+        <w:gridCol w:w="6360"/>
+      </w:tblGrid>
+      <w:tr>
+        <w:trPr>
+          <w:cantSplit/>
+          <w:tblHeader w:val="true"/>
+        </w:trPr>
+        <w:tc>
+          <w:tcPr>
+            <w:tcW w:type="dxa" w:w="3000"/>
+            <w:vAlign w:val="center"/>
+            <w:tcMar>
+              <w:top w:w="80" w:type="dxa"/>
+              <w:bottom w:w="80" w:type="dxa"/>
+              <w:start w:w="120" w:type="dxa"/>
+              <w:end w:w="120" w:type="dxa"/>
+            </w:tcMar>
+            <w:shd w:fill="E8EEF5"/>
+          </w:tcPr>
+          <w:p>
+            <w:r>
+              <w:rPr>
+                <w:b/>
+                <w:color w:val="1F4D78"/>
+              </w:rPr>
+              <w:t>Workbook column group</w:t>
+            </w:r>
+          </w:p>
+        </w:tc>
+        <w:tc>
+          <w:tcPr>
+            <w:tcW w:type="dxa" w:w="6360"/>
+            <w:vAlign w:val="center"/>
+            <w:tcMar>
+              <w:top w:w="80" w:type="dxa"/>
+              <w:bottom w:w="80" w:type="dxa"/>
+              <w:start w:w="120" w:type="dxa"/>
+              <w:end w:w="120" w:type="dxa"/>
+            </w:tcMar>
+            <w:shd w:fill="E8EEF5"/>
+          </w:tcPr>
+          <w:p>
+            <w:r>
+              <w:rPr>
+                <w:b/>
+                <w:color w:val="1F4D78"/>
+              </w:rPr>
+              <w:t>Columns</w:t>
+            </w:r>
+          </w:p>
+        </w:tc>
+      </w:tr>
+      <w:tr>
+        <w:trPr>
+          <w:cantSplit/>
+        </w:trPr>
+        <w:tc>
+          <w:tcPr>
+            <w:tcW w:type="dxa" w:w="3000"/>
+            <w:shd w:fill="F2F4F7"/>
+            <w:vAlign w:val="center"/>
+            <w:tcMar>
+              <w:top w:w="80" w:type="dxa"/>
+              <w:bottom w:w="80" w:type="dxa"/>
+              <w:start w:w="120" w:type="dxa"/>
+              <w:end w:w="120" w:type="dxa"/>
+            </w:tcMar>
+          </w:tcPr>
+          <w:p>
+            <w:r>
+              <w:rPr>
+                <w:b/>
+              </w:rPr>
+              <w:t>Galaxy</w:t>
+            </w:r>
+          </w:p>
+        </w:tc>
+        <w:tc>
+          <w:tcPr>
+            <w:tcW w:type="dxa" w:w="6360"/>
+            <w:vAlign w:val="center"/>
+            <w:tcMar>
+              <w:top w:w="80" w:type="dxa"/>
+              <w:bottom w:w="80" w:type="dxa"/>
+              <w:start w:w="120" w:type="dxa"/>
+              <w:end w:w="120" w:type="dxa"/>
+            </w:tcMar>
+          </w:tcPr>
+          <w:p>
+            <w:r>
+              <w:t>galaxy name</w:t>
+            </w:r>
+          </w:p>
+        </w:tc>
+      </w:tr>
+      <w:tr>
+        <w:trPr>
+          <w:cantSplit/>
+        </w:trPr>
+        <w:tc>
+          <w:tcPr>
+            <w:tcW w:type="dxa" w:w="3000"/>
+            <w:shd w:fill="F2F4F7"/>
+            <w:vAlign w:val="center"/>
+            <w:tcMar>
+              <w:top w:w="80" w:type="dxa"/>
+              <w:bottom w:w="80" w:type="dxa"/>
+              <w:start w:w="120" w:type="dxa"/>
+              <w:end w:w="120" w:type="dxa"/>
+            </w:tcMar>
+          </w:tcPr>
+          <w:p>
+            <w:r>
+              <w:rPr>
+                <w:b/>
+              </w:rPr>
+              <w:t>Manual visual review</w:t>
+            </w:r>
+          </w:p>
+        </w:tc>
+        <w:tc>
+          <w:tcPr>
+            <w:tcW w:type="dxa" w:w="6360"/>
+            <w:vAlign w:val="center"/>
+            <w:tcMar>
+              <w:top w:w="80" w:type="dxa"/>
+              <w:bottom w:w="80" w:type="dxa"/>
+              <w:start w:w="120" w:type="dxa"/>
+              <w:end w:w="120" w:type="dxa"/>
+            </w:tcMar>
+          </w:tcPr>
+          <w:p>
+            <w:r>
+              <w:t>isophote profile PDF, GB visual class, GB visual notes</w:t>
+            </w:r>
+          </w:p>
+        </w:tc>
+      </w:tr>
+      <w:tr>
+        <w:trPr>
+          <w:cantSplit/>
+        </w:trPr>
+        <w:tc>
+          <w:tcPr>
+            <w:tcW w:type="dxa" w:w="3000"/>
+            <w:shd w:fill="F2F4F7"/>
+            <w:vAlign w:val="center"/>
+            <w:tcMar>
+              <w:top w:w="80" w:type="dxa"/>
+              <w:bottom w:w="80" w:type="dxa"/>
+              <w:start w:w="120" w:type="dxa"/>
+              <w:end w:w="120" w:type="dxa"/>
+            </w:tcMar>
+          </w:tcPr>
+          <w:p>
+            <w:r>
+              <w:rPr>
+                <w:b/>
+              </w:rPr>
+              <w:t>PE/VPD profile classifications</w:t>
+            </w:r>
+          </w:p>
+        </w:tc>
+        <w:tc>
+          <w:tcPr>
+            <w:tcW w:type="dxa" w:w="6360"/>
+            <w:vAlign w:val="center"/>
+            <w:tcMar>
+              <w:top w:w="80" w:type="dxa"/>
+              <w:bottom w:w="80" w:type="dxa"/>
+              <w:start w:w="120" w:type="dxa"/>
+              <w:end w:w="120" w:type="dxa"/>
+            </w:tcMar>
+          </w:tcPr>
+          <w:p>
+            <w:r>
+              <w:t>PE classification, PE profile class, PE profile label, VPD classification, VPD profile class, VPD profile label</w:t>
+            </w:r>
+          </w:p>
+        </w:tc>
+      </w:tr>
+      <w:tr>
+        <w:trPr>
+          <w:cantSplit/>
+        </w:trPr>
+        <w:tc>
+          <w:tcPr>
+            <w:tcW w:type="dxa" w:w="3000"/>
+            <w:shd w:fill="F2F4F7"/>
+            <w:vAlign w:val="center"/>
+            <w:tcMar>
+              <w:top w:w="80" w:type="dxa"/>
+              <w:bottom w:w="80" w:type="dxa"/>
+              <w:start w:w="120" w:type="dxa"/>
+              <w:end w:w="120" w:type="dxa"/>
+            </w:tcMar>
+          </w:tcPr>
+          <w:p>
+            <w:r>
+              <w:rPr>
+                <w:b/>
+              </w:rPr>
+              <w:t>SRA output</w:t>
+            </w:r>
+          </w:p>
+        </w:tc>
+        <w:tc>
+          <w:tcPr>
+            <w:tcW w:type="dxa" w:w="6360"/>
+            <w:vAlign w:val="center"/>
+            <w:tcMar>
+              <w:top w:w="80" w:type="dxa"/>
+              <w:bottom w:w="80" w:type="dxa"/>
+              <w:start w:w="120" w:type="dxa"/>
+              <w:end w:w="120" w:type="dxa"/>
+            </w:tcMar>
+          </w:tcPr>
+          <w:p>
+            <w:r>
+              <w:t>sra_classification, sra_classification_detail, left_shoulder_found, right_shoulder_found, failed_extrema, d_extrema, d2_extrema, roc_minima</w:t>
+            </w:r>
+          </w:p>
+        </w:tc>
+      </w:tr>
+    </w:tbl>
+    <w:p/>
+    <w:tbl>
+      <w:tblPr>
+        <w:tblStyle w:val="TableGrid"/>
+        <w:tblW w:type="dxa" w:w="9360"/>
+        <w:tblLayout w:type="fixed"/>
+        <w:tblLook w:firstColumn="1" w:firstRow="1" w:lastColumn="0" w:lastRow="0" w:noHBand="0" w:noVBand="1" w:val="04A0"/>
+        <w:jc w:val="left"/>
+        <w:tblInd w:w="120" w:type="dxa"/>
+      </w:tblPr>
+      <w:tblGrid>
+        <w:gridCol w:w="3000"/>
+        <w:gridCol w:w="6360"/>
+      </w:tblGrid>
+      <w:tr>
+        <w:trPr>
+          <w:cantSplit/>
+          <w:tblHeader w:val="true"/>
+        </w:trPr>
+        <w:tc>
+          <w:tcPr>
+            <w:tcW w:type="dxa" w:w="3000"/>
+            <w:vAlign w:val="center"/>
+            <w:tcMar>
+              <w:top w:w="80" w:type="dxa"/>
+              <w:bottom w:w="80" w:type="dxa"/>
+              <w:start w:w="120" w:type="dxa"/>
+              <w:end w:w="120" w:type="dxa"/>
+            </w:tcMar>
+            <w:shd w:fill="E8EEF5"/>
+          </w:tcPr>
+          <w:p>
+            <w:r>
+              <w:rPr>
+                <w:b/>
+                <w:color w:val="1F4D78"/>
+              </w:rPr>
+              <w:t>Display label</w:t>
+            </w:r>
+          </w:p>
+        </w:tc>
+        <w:tc>
+          <w:tcPr>
+            <w:tcW w:type="dxa" w:w="6360"/>
+            <w:vAlign w:val="center"/>
+            <w:tcMar>
+              <w:top w:w="80" w:type="dxa"/>
+              <w:bottom w:w="80" w:type="dxa"/>
+              <w:start w:w="120" w:type="dxa"/>
+              <w:end w:w="120" w:type="dxa"/>
+            </w:tcMar>
+            <w:shd w:fill="E8EEF5"/>
+          </w:tcPr>
+          <w:p>
+            <w:r>
+              <w:rPr>
+                <w:b/>
+                <w:color w:val="1F4D78"/>
+              </w:rPr>
+              <w:t>Source profile code(s)</w:t>
+            </w:r>
+          </w:p>
+        </w:tc>
+      </w:tr>
+      <w:tr>
+        <w:trPr>
+          <w:cantSplit/>
+        </w:trPr>
+        <w:tc>
+          <w:tcPr>
+            <w:tcW w:type="dxa" w:w="3000"/>
+            <w:shd w:fill="F2F4F7"/>
+            <w:vAlign w:val="center"/>
+            <w:tcMar>
+              <w:top w:w="80" w:type="dxa"/>
+              <w:bottom w:w="80" w:type="dxa"/>
+              <w:start w:w="120" w:type="dxa"/>
+              <w:end w:w="120" w:type="dxa"/>
+            </w:tcMar>
+          </w:tcPr>
+          <w:p>
+            <w:r>
+              <w:rPr>
+                <w:b/>
+              </w:rPr>
+              <w:t>Peak+Sh</w:t>
+            </w:r>
+          </w:p>
+        </w:tc>
+        <w:tc>
+          <w:tcPr>
+            <w:tcW w:type="dxa" w:w="6360"/>
+            <w:vAlign w:val="center"/>
+            <w:tcMar>
+              <w:top w:w="80" w:type="dxa"/>
+              <w:bottom w:w="80" w:type="dxa"/>
+              <w:start w:w="120" w:type="dxa"/>
+              <w:end w:w="120" w:type="dxa"/>
+            </w:tcMar>
+          </w:tcPr>
+          <w:p>
+            <w:r>
+              <w:t>BP</w:t>
+            </w:r>
+          </w:p>
+        </w:tc>
+      </w:tr>
+      <w:tr>
+        <w:trPr>
+          <w:cantSplit/>
+        </w:trPr>
+        <w:tc>
+          <w:tcPr>
+            <w:tcW w:type="dxa" w:w="3000"/>
+            <w:shd w:fill="F2F4F7"/>
+            <w:vAlign w:val="center"/>
+            <w:tcMar>
+              <w:top w:w="80" w:type="dxa"/>
+              <w:bottom w:w="80" w:type="dxa"/>
+              <w:start w:w="120" w:type="dxa"/>
+              <w:end w:w="120" w:type="dxa"/>
+            </w:tcMar>
+          </w:tcPr>
+          <w:p>
+            <w:r>
+              <w:rPr>
+                <w:b/>
+              </w:rPr>
+              <w:t>Exp</w:t>
+            </w:r>
+          </w:p>
+        </w:tc>
+        <w:tc>
+          <w:tcPr>
+            <w:tcW w:type="dxa" w:w="6360"/>
+            <w:vAlign w:val="center"/>
+            <w:tcMar>
+              <w:top w:w="80" w:type="dxa"/>
+              <w:bottom w:w="80" w:type="dxa"/>
+              <w:start w:w="120" w:type="dxa"/>
+              <w:end w:w="120" w:type="dxa"/>
+            </w:tcMar>
+          </w:tcPr>
+          <w:p>
+            <w:r>
+              <w:t>Exp, Exp(N)</w:t>
+            </w:r>
+          </w:p>
+        </w:tc>
+      </w:tr>
+      <w:tr>
+        <w:trPr>
+          <w:cantSplit/>
+        </w:trPr>
+        <w:tc>
+          <w:tcPr>
+            <w:tcW w:type="dxa" w:w="3000"/>
+            <w:shd w:fill="F2F4F7"/>
+            <w:vAlign w:val="center"/>
+            <w:tcMar>
+              <w:top w:w="80" w:type="dxa"/>
+              <w:bottom w:w="80" w:type="dxa"/>
+              <w:start w:w="120" w:type="dxa"/>
+              <w:end w:w="120" w:type="dxa"/>
+            </w:tcMar>
+          </w:tcPr>
+          <w:p>
+            <w:r>
+              <w:rPr>
+                <w:b/>
+              </w:rPr>
+              <w:t>Flat-top (FT)</w:t>
+            </w:r>
+          </w:p>
+        </w:tc>
+        <w:tc>
+          <w:tcPr>
+            <w:tcW w:type="dxa" w:w="6360"/>
+            <w:vAlign w:val="center"/>
+            <w:tcMar>
+              <w:top w:w="80" w:type="dxa"/>
+              <w:bottom w:w="80" w:type="dxa"/>
+              <w:start w:w="120" w:type="dxa"/>
+              <w:end w:w="120" w:type="dxa"/>
+            </w:tcMar>
+          </w:tcPr>
+          <w:p>
+            <w:r>
+              <w:t>FT, FT(N), Flat-top, Flat-top(N)</w:t>
+            </w:r>
+          </w:p>
+        </w:tc>
+      </w:tr>
+      <w:tr>
+        <w:trPr>
+          <w:cantSplit/>
+        </w:trPr>
+        <w:tc>
+          <w:tcPr>
+            <w:tcW w:type="dxa" w:w="3000"/>
+            <w:shd w:fill="F2F4F7"/>
+            <w:vAlign w:val="center"/>
+            <w:tcMar>
+              <w:top w:w="80" w:type="dxa"/>
+              <w:bottom w:w="80" w:type="dxa"/>
+              <w:start w:w="120" w:type="dxa"/>
+              <w:end w:w="120" w:type="dxa"/>
+            </w:tcMar>
+          </w:tcPr>
+          <w:p>
+            <w:r>
+              <w:rPr>
+                <w:b/>
+              </w:rPr>
+              <w:t>Two-slope (2S)</w:t>
+            </w:r>
+          </w:p>
+        </w:tc>
+        <w:tc>
+          <w:tcPr>
+            <w:tcW w:type="dxa" w:w="6360"/>
+            <w:vAlign w:val="center"/>
+            <w:tcMar>
+              <w:top w:w="80" w:type="dxa"/>
+              <w:bottom w:w="80" w:type="dxa"/>
+              <w:start w:w="120" w:type="dxa"/>
+              <w:end w:w="120" w:type="dxa"/>
+            </w:tcMar>
+          </w:tcPr>
+          <w:p>
+            <w:r>
+              <w:t>2S, 2S(N), Two-slope, Two-slope(N)</w:t>
             </w:r>
           </w:p>
         </w:tc>
@@ -3314,7 +5046,7 @@
         <w:ind w:left="540" w:hanging="271"/>
       </w:pPr>
       <w:r>
-        <w:t>The script is not command-line parameterised; changing data locations or thresholds requires editing global variables in the source file.</w:t>
+        <w:t>The research-folder location is command-line parameterised with --pc Laptop/Desktop; changing thresholds still requires editing global variables in the source file.</w:t>
       </w:r>
     </w:p>
     <w:p>
@@ -3382,7 +5114,7 @@
         <w:ind w:left="540" w:hanging="271"/>
       </w:pPr>
       <w:r>
-        <w:t>Add argparse options or a small configuration file for data paths, output path, and shoulder thresholds.</w:t>
+        <w:t>Extend argparse or add a small configuration file for shoulder thresholds and output options.</w:t>
       </w:r>
     </w:p>
     <w:p>

</xml_diff>

<commit_message>
Enhance visual classification documentation and workflow instructions in the shoulder quantification project
</commit_message>
<xml_diff>
--- a/Shoulder Recognition Erwin/documentation/Real Galaxy Shoulder Quantification v0.69 Documentation.docx
+++ b/Shoulder Recognition Erwin/documentation/Real Galaxy Shoulder Quantification v0.69 Documentation.docx
@@ -211,7 +211,7 @@
           </w:tcPr>
           <w:p>
             <w:r>
-              <w:t>2026-06-25</w:t>
+              <w:t>2026-07-01</w:t>
             </w:r>
           </w:p>
         </w:tc>
@@ -4235,6 +4235,416 @@
         <w:pStyle w:val="Heading1"/>
       </w:pPr>
       <w:r>
+        <w:t>Visual Classification Instructions</w:t>
+      </w:r>
+    </w:p>
+    <w:p>
+      <w:r>
+        <w:rPr>
+          <w:b w:val="0"/>
+        </w:rPr>
+        <w:t>The visual-classification workflow is designed to review the individual isophote profile PDFs and write the manual GB classification into the same Classifications sheet that already contains PE, VPD, and SRA outputs. The result is one merged workbook row per galaxy with the manual visual classification beside the classifier outputs.</w:t>
+      </w:r>
+    </w:p>
+    <w:p>
+      <w:pPr>
+        <w:pStyle w:val="Heading2"/>
+      </w:pPr>
+      <w:r>
+        <w:t>Before starting</w:t>
+      </w:r>
+    </w:p>
+    <w:p>
+      <w:pPr>
+        <w:pStyle w:val="ListBullet"/>
+        <w:spacing w:after="80" w:line="300" w:lineRule="auto"/>
+        <w:ind w:left="540" w:hanging="271"/>
+      </w:pPr>
+      <w:r>
+        <w:t>Close PE_VPD_galaxy_classifications_with_definitions.xlsx before using the gallery server. Excel can lock the file and prevent browser edits from being saved.</w:t>
+      </w:r>
+    </w:p>
+    <w:p>
+      <w:pPr>
+        <w:pStyle w:val="ListBullet"/>
+        <w:spacing w:after="80" w:line="300" w:lineRule="auto"/>
+        <w:ind w:left="540" w:hanging="271"/>
+      </w:pPr>
+      <w:r>
+        <w:t>Use the workbook-writing server page, not only the static HTML file, when classifications need to write back to the workbook.</w:t>
+      </w:r>
+    </w:p>
+    <w:p>
+      <w:pPr>
+        <w:pStyle w:val="ListBullet"/>
+        <w:spacing w:after="80" w:line="300" w:lineRule="auto"/>
+        <w:ind w:left="540" w:hanging="271"/>
+      </w:pPr>
+      <w:r>
+        <w:t>The Laptop launcher starts the server on http://127.0.0.1:8899/ and uses the Laptop Dropbox research-folder path.</w:t>
+      </w:r>
+    </w:p>
+    <w:p>
+      <w:pPr>
+        <w:pStyle w:val="Heading2"/>
+      </w:pPr>
+      <w:r>
+        <w:t>Start the workbook-writing gallery</w:t>
+      </w:r>
+    </w:p>
+    <w:p>
+      <w:pPr>
+        <w:pStyle w:val="ListNumber"/>
+        <w:spacing w:after="80" w:line="300" w:lineRule="auto"/>
+        <w:ind w:left="540" w:hanging="271"/>
+      </w:pPr>
+      <w:r>
+        <w:t>Open PowerShell in C:\Users\gordo\Documents\GitHub\PythonScripts.</w:t>
+      </w:r>
+    </w:p>
+    <w:p>
+      <w:pPr>
+        <w:pStyle w:val="ListNumber"/>
+        <w:spacing w:after="80" w:line="300" w:lineRule="auto"/>
+        <w:ind w:left="540" w:hanging="271"/>
+      </w:pPr>
+      <w:r>
+        <w:t>Run: &amp; "C:\Users\gordo\Documents\GitHub\PythonScripts\Shoulder Recognition Erwin\Run Bar Profile Visual Gallery Server Laptop.bat"</w:t>
+      </w:r>
+    </w:p>
+    <w:p>
+      <w:pPr>
+        <w:pStyle w:val="ListNumber"/>
+        <w:spacing w:after="80" w:line="300" w:lineRule="auto"/>
+        <w:ind w:left="540" w:hanging="271"/>
+      </w:pPr>
+      <w:r>
+        <w:t>Open http://127.0.0.1:8899/ in the browser.</w:t>
+      </w:r>
+    </w:p>
+    <w:p>
+      <w:pPr>
+        <w:pStyle w:val="ListNumber"/>
+        <w:spacing w:after="80" w:line="300" w:lineRule="auto"/>
+        <w:ind w:left="540" w:hanging="271"/>
+      </w:pPr>
+      <w:r>
+        <w:t>Check that the page header shows v2026-06-25 hide-all. If an older page appears, restart the batch file and refresh with Ctrl+F5.</w:t>
+      </w:r>
+    </w:p>
+    <w:p>
+      <w:pPr>
+        <w:pStyle w:val="Heading2"/>
+      </w:pPr>
+      <w:r>
+        <w:t>Classify galaxies visually</w:t>
+      </w:r>
+    </w:p>
+    <w:p>
+      <w:pPr>
+        <w:pStyle w:val="ListNumber"/>
+        <w:spacing w:after="80" w:line="300" w:lineRule="auto"/>
+        <w:ind w:left="540" w:hanging="271"/>
+      </w:pPr>
+      <w:r>
+        <w:t>Keep Reveal Classifiers off for a blind visual pass. With the switch off, PE, VPD, and SRA are hidden for every galaxy.</w:t>
+      </w:r>
+    </w:p>
+    <w:p>
+      <w:pPr>
+        <w:pStyle w:val="ListNumber"/>
+        <w:spacing w:after="80" w:line="300" w:lineRule="auto"/>
+        <w:ind w:left="540" w:hanging="271"/>
+      </w:pPr>
+      <w:r>
+        <w:t>Inspect the right-hand major-axis bar-profile plot in the embedded isophote PDF. Use Open PDF if the embedded view is too small.</w:t>
+      </w:r>
+    </w:p>
+    <w:p>
+      <w:pPr>
+        <w:pStyle w:val="ListNumber"/>
+        <w:spacing w:after="80" w:line="300" w:lineRule="auto"/>
+        <w:ind w:left="540" w:hanging="271"/>
+      </w:pPr>
+      <w:r>
+        <w:t>Use the classification picker to select Peak+Sh, Exp, Flat-top (FT), Two-slope (2S), or Unclear.</w:t>
+      </w:r>
+    </w:p>
+    <w:p>
+      <w:pPr>
+        <w:pStyle w:val="ListNumber"/>
+        <w:spacing w:after="80" w:line="300" w:lineRule="auto"/>
+        <w:ind w:left="540" w:hanging="271"/>
+      </w:pPr>
+      <w:r>
+        <w:t>Add any comments in the Notes field.</w:t>
+      </w:r>
+    </w:p>
+    <w:p>
+      <w:pPr>
+        <w:pStyle w:val="ListNumber"/>
+        <w:spacing w:after="80" w:line="300" w:lineRule="auto"/>
+        <w:ind w:left="540" w:hanging="271"/>
+      </w:pPr>
+      <w:r>
+        <w:t>Wait for the page to show Saved to workbook. The selected class is written to GB visual class and the notes are written to GB visual notes in the workbook.</w:t>
+      </w:r>
+    </w:p>
+    <w:p>
+      <w:pPr>
+        <w:pStyle w:val="ListNumber"/>
+        <w:spacing w:after="80" w:line="300" w:lineRule="auto"/>
+        <w:ind w:left="540" w:hanging="271"/>
+      </w:pPr>
+      <w:r>
+        <w:t>Use Export CSV as an optional browser-side backup of the visual classifications.</w:t>
+      </w:r>
+    </w:p>
+    <w:p>
+      <w:pPr>
+        <w:pStyle w:val="Heading2"/>
+      </w:pPr>
+      <w:r>
+        <w:t>Merge with classifier results</w:t>
+      </w:r>
+    </w:p>
+    <w:p>
+      <w:r>
+        <w:rPr>
+          <w:b w:val="0"/>
+        </w:rPr>
+        <w:t>No separate merge step is needed after using the server page: the workbook is updated in place. Each galaxy row then contains the manual GB visual result, PE/VPD profile classifications, and SRA output columns together.</w:t>
+      </w:r>
+    </w:p>
+    <w:tbl>
+      <w:tblPr>
+        <w:tblStyle w:val="TableGrid"/>
+        <w:tblW w:type="dxa" w:w="9360"/>
+        <w:tblLayout w:type="fixed"/>
+        <w:tblLook w:firstColumn="1" w:firstRow="1" w:lastColumn="0" w:lastRow="0" w:noHBand="0" w:noVBand="1" w:val="04A0"/>
+        <w:jc w:val="left"/>
+        <w:tblInd w:w="120" w:type="dxa"/>
+      </w:tblPr>
+      <w:tblGrid>
+        <w:gridCol w:w="2800"/>
+        <w:gridCol w:w="6560"/>
+      </w:tblGrid>
+      <w:tr>
+        <w:trPr>
+          <w:cantSplit/>
+          <w:tblHeader w:val="true"/>
+        </w:trPr>
+        <w:tc>
+          <w:tcPr>
+            <w:tcW w:type="dxa" w:w="2800"/>
+            <w:vAlign w:val="center"/>
+            <w:tcMar>
+              <w:top w:w="80" w:type="dxa"/>
+              <w:bottom w:w="80" w:type="dxa"/>
+              <w:start w:w="120" w:type="dxa"/>
+              <w:end w:w="120" w:type="dxa"/>
+            </w:tcMar>
+            <w:shd w:fill="E8EEF5"/>
+          </w:tcPr>
+          <w:p>
+            <w:r>
+              <w:rPr>
+                <w:b/>
+                <w:color w:val="1F4D78"/>
+              </w:rPr>
+              <w:t>Result source</w:t>
+            </w:r>
+          </w:p>
+        </w:tc>
+        <w:tc>
+          <w:tcPr>
+            <w:tcW w:type="dxa" w:w="6560"/>
+            <w:vAlign w:val="center"/>
+            <w:tcMar>
+              <w:top w:w="80" w:type="dxa"/>
+              <w:bottom w:w="80" w:type="dxa"/>
+              <w:start w:w="120" w:type="dxa"/>
+              <w:end w:w="120" w:type="dxa"/>
+            </w:tcMar>
+            <w:shd w:fill="E8EEF5"/>
+          </w:tcPr>
+          <w:p>
+            <w:r>
+              <w:rPr>
+                <w:b/>
+                <w:color w:val="1F4D78"/>
+              </w:rPr>
+              <w:t>Workbook columns</w:t>
+            </w:r>
+          </w:p>
+        </w:tc>
+      </w:tr>
+      <w:tr>
+        <w:trPr>
+          <w:cantSplit/>
+        </w:trPr>
+        <w:tc>
+          <w:tcPr>
+            <w:tcW w:type="dxa" w:w="2800"/>
+            <w:shd w:fill="F2F4F7"/>
+            <w:vAlign w:val="center"/>
+            <w:tcMar>
+              <w:top w:w="80" w:type="dxa"/>
+              <w:bottom w:w="80" w:type="dxa"/>
+              <w:start w:w="120" w:type="dxa"/>
+              <w:end w:w="120" w:type="dxa"/>
+            </w:tcMar>
+          </w:tcPr>
+          <w:p>
+            <w:r>
+              <w:rPr>
+                <w:b/>
+              </w:rPr>
+              <w:t>Manual visual review</w:t>
+            </w:r>
+          </w:p>
+        </w:tc>
+        <w:tc>
+          <w:tcPr>
+            <w:tcW w:type="dxa" w:w="6560"/>
+            <w:vAlign w:val="center"/>
+            <w:tcMar>
+              <w:top w:w="80" w:type="dxa"/>
+              <w:bottom w:w="80" w:type="dxa"/>
+              <w:start w:w="120" w:type="dxa"/>
+              <w:end w:w="120" w:type="dxa"/>
+            </w:tcMar>
+          </w:tcPr>
+          <w:p>
+            <w:r>
+              <w:t>GB visual class, GB visual notes</w:t>
+            </w:r>
+          </w:p>
+        </w:tc>
+      </w:tr>
+      <w:tr>
+        <w:trPr>
+          <w:cantSplit/>
+        </w:trPr>
+        <w:tc>
+          <w:tcPr>
+            <w:tcW w:type="dxa" w:w="2800"/>
+            <w:shd w:fill="F2F4F7"/>
+            <w:vAlign w:val="center"/>
+            <w:tcMar>
+              <w:top w:w="80" w:type="dxa"/>
+              <w:bottom w:w="80" w:type="dxa"/>
+              <w:start w:w="120" w:type="dxa"/>
+              <w:end w:w="120" w:type="dxa"/>
+            </w:tcMar>
+          </w:tcPr>
+          <w:p>
+            <w:r>
+              <w:rPr>
+                <w:b/>
+              </w:rPr>
+              <w:t>PE/VPD classifiers</w:t>
+            </w:r>
+          </w:p>
+        </w:tc>
+        <w:tc>
+          <w:tcPr>
+            <w:tcW w:type="dxa" w:w="6560"/>
+            <w:vAlign w:val="center"/>
+            <w:tcMar>
+              <w:top w:w="80" w:type="dxa"/>
+              <w:bottom w:w="80" w:type="dxa"/>
+              <w:start w:w="120" w:type="dxa"/>
+              <w:end w:w="120" w:type="dxa"/>
+            </w:tcMar>
+          </w:tcPr>
+          <w:p>
+            <w:r>
+              <w:t>PE classification, PE profile class, PE profile label, VPD classification, VPD profile class, VPD profile label</w:t>
+            </w:r>
+          </w:p>
+        </w:tc>
+      </w:tr>
+      <w:tr>
+        <w:trPr>
+          <w:cantSplit/>
+        </w:trPr>
+        <w:tc>
+          <w:tcPr>
+            <w:tcW w:type="dxa" w:w="2800"/>
+            <w:shd w:fill="F2F4F7"/>
+            <w:vAlign w:val="center"/>
+            <w:tcMar>
+              <w:top w:w="80" w:type="dxa"/>
+              <w:bottom w:w="80" w:type="dxa"/>
+              <w:start w:w="120" w:type="dxa"/>
+              <w:end w:w="120" w:type="dxa"/>
+            </w:tcMar>
+          </w:tcPr>
+          <w:p>
+            <w:r>
+              <w:rPr>
+                <w:b/>
+              </w:rPr>
+              <w:t>SRA classifier</w:t>
+            </w:r>
+          </w:p>
+        </w:tc>
+        <w:tc>
+          <w:tcPr>
+            <w:tcW w:type="dxa" w:w="6560"/>
+            <w:vAlign w:val="center"/>
+            <w:tcMar>
+              <w:top w:w="80" w:type="dxa"/>
+              <w:bottom w:w="80" w:type="dxa"/>
+              <w:start w:w="120" w:type="dxa"/>
+              <w:end w:w="120" w:type="dxa"/>
+            </w:tcMar>
+          </w:tcPr>
+          <w:p>
+            <w:r>
+              <w:t>sra_classification, sra_classification_detail, left_shoulder_found, right_shoulder_found, failed_extrema, d_extrema, d2_extrema, roc_minima</w:t>
+            </w:r>
+          </w:p>
+        </w:tc>
+      </w:tr>
+    </w:tbl>
+    <w:p/>
+    <w:p>
+      <w:pPr>
+        <w:pStyle w:val="ListBullet"/>
+        <w:spacing w:after="80" w:line="300" w:lineRule="auto"/>
+        <w:ind w:left="540" w:hanging="271"/>
+      </w:pPr>
+      <w:r>
+        <w:t>After the visual pass, open PE_VPD_galaxy_classifications_with_definitions.xlsx and use filters to compare GB visual class with PE profile label, VPD profile label, and sra_classification.</w:t>
+      </w:r>
+    </w:p>
+    <w:p>
+      <w:pPr>
+        <w:pStyle w:val="ListBullet"/>
+        <w:spacing w:after="80" w:line="300" w:lineRule="auto"/>
+        <w:ind w:left="540" w:hanging="271"/>
+      </w:pPr>
+      <w:r>
+        <w:t>Turn Reveal Classifiers on in the gallery only when checking or comparing against the PE/VPD/SRA outputs.</w:t>
+      </w:r>
+    </w:p>
+    <w:p>
+      <w:pPr>
+        <w:pStyle w:val="ListBullet"/>
+        <w:spacing w:after="80" w:line="300" w:lineRule="auto"/>
+        <w:ind w:left="540" w:hanging="271"/>
+      </w:pPr>
+      <w:r>
+        <w:t>If PE/VPD/SRA results are regenerated later, rerun Merge Shoulder Classifications Into Workbook.py and then Format PE VPD Classification Workbook.py. The formatter preserves the GB visual class and GB visual notes columns while restoring the preferred column order and styling.</w:t>
+      </w:r>
+    </w:p>
+    <w:p>
+      <w:pPr>
+        <w:pStyle w:val="Heading1"/>
+      </w:pPr>
+      <w:r>
         <w:t>Detailed Code Documentation</w:t>
       </w:r>
     </w:p>

</xml_diff>

<commit_message>
Enhance documentation and functionality for foreground mask generation
- Updated `build_shoulder_quantification_docs.py` to improve the formatting of numbered lists and added new command-line parameters for the visual gallery.
- Added a new batch file `Run Bar Profile Visual Gallery Server Desktop.bat` for launching the gallery server on desktop.
- Introduced `foreground_mask_photutils.py` for building foreground/background masks for barred-galaxy FITS images, including detailed functionality for source detection and mask generation.
- Updated dependencies in `pyproject.toml` and `requirements.txt` to include `photutils` for image processing tasks.
</commit_message>
<xml_diff>
--- a/Shoulder Recognition Erwin/documentation/Real Galaxy Shoulder Quantification v0.69 Documentation.docx
+++ b/Shoulder Recognition Erwin/documentation/Real Galaxy Shoulder Quantification v0.69 Documentation.docx
@@ -168,7 +168,7 @@
           </w:tcPr>
           <w:p>
             <w:r>
-              <w:t>C:\Users\gordo\Documents\GitHub\PythonScripts\Shoulder Recognition Erwin\Real Galaxy Shoulder Quantification v0.69.py</w:t>
+              <w:t>C:\Users\gordo\Documents\Github\PythonScripts\Shoulder Recognition Erwin\Real Galaxy Shoulder Quantification v0.69.py</w:t>
             </w:r>
           </w:p>
         </w:tc>
@@ -211,7 +211,7 @@
           </w:tcPr>
           <w:p>
             <w:r>
-              <w:t>2026-07-01</w:t>
+              <w:t>2026-07-03</w:t>
             </w:r>
           </w:p>
         </w:tc>
@@ -448,7 +448,7 @@
         <w:ind w:left="540" w:hanging="271"/>
       </w:pPr>
       <w:r>
-        <w:t>The gallery can also be run with --serve, which starts a local server and writes GB visual class and GB visual notes changes directly back to the workbook. The Laptop launcher uses http://127.0.0.1:8899/.</w:t>
+        <w:t>The gallery can also be run with --serve, which starts a local server and writes GB visual class and GB visual notes changes directly back to the workbook. Laptop and Desktop launchers use http://127.0.0.1:8899/.</w:t>
       </w:r>
     </w:p>
     <w:tbl>
@@ -811,6 +811,49 @@
           <w:p>
             <w:r>
               <w:t>Run the workbook-writing local gallery server at http://127.0.0.1:8899/.</w:t>
+            </w:r>
+          </w:p>
+        </w:tc>
+      </w:tr>
+      <w:tr>
+        <w:trPr>
+          <w:cantSplit/>
+        </w:trPr>
+        <w:tc>
+          <w:tcPr>
+            <w:tcW w:type="dxa" w:w="4300"/>
+            <w:shd w:fill="F2F4F7"/>
+            <w:vAlign w:val="center"/>
+            <w:tcMar>
+              <w:top w:w="80" w:type="dxa"/>
+              <w:bottom w:w="80" w:type="dxa"/>
+              <w:start w:w="120" w:type="dxa"/>
+              <w:end w:w="120" w:type="dxa"/>
+            </w:tcMar>
+          </w:tcPr>
+          <w:p>
+            <w:r>
+              <w:rPr>
+                <w:b/>
+              </w:rPr>
+              <w:t>python "Shoulder Recognition Erwin\Build Bar Profile Visual Gallery.py" --pc Desktop --serve --port 8899</w:t>
+            </w:r>
+          </w:p>
+        </w:tc>
+        <w:tc>
+          <w:tcPr>
+            <w:tcW w:type="dxa" w:w="5060"/>
+            <w:vAlign w:val="center"/>
+            <w:tcMar>
+              <w:top w:w="80" w:type="dxa"/>
+              <w:bottom w:w="80" w:type="dxa"/>
+              <w:start w:w="120" w:type="dxa"/>
+              <w:end w:w="120" w:type="dxa"/>
+            </w:tcMar>
+          </w:tcPr>
+          <w:p>
+            <w:r>
+              <w:t>Run the same workbook-writing gallery server using the Desktop Dropbox path.</w:t>
             </w:r>
           </w:p>
         </w:tc>
@@ -1626,90 +1669,135 @@
     </w:p>
     <w:p>
       <w:pPr>
-        <w:pStyle w:val="ListNumber"/>
         <w:spacing w:after="80" w:line="300" w:lineRule="auto"/>
         <w:ind w:left="540" w:hanging="271"/>
       </w:pPr>
+      <w:r>
+        <w:rPr>
+          <w:b/>
+        </w:rPr>
+        <w:t xml:space="preserve">1.  </w:t>
+      </w:r>
       <w:r>
         <w:t>Initialise paths, create output, plots, and profiles folders, and add local helper-module directories to sys.path.</w:t>
       </w:r>
     </w:p>
     <w:p>
       <w:pPr>
-        <w:pStyle w:val="ListNumber"/>
         <w:spacing w:after="80" w:line="300" w:lineRule="auto"/>
         <w:ind w:left="540" w:hanging="271"/>
       </w:pPr>
+      <w:r>
+        <w:rPr>
+          <w:b/>
+        </w:rPr>
+        <w:t xml:space="preserve">2.  </w:t>
+      </w:r>
       <w:r>
         <w:t>Read the Erwin S4G bar table, the scrambled-name map, the two classification files, and the S4G image geometry manifest.</w:t>
       </w:r>
     </w:p>
     <w:p>
       <w:pPr>
-        <w:pStyle w:val="ListNumber"/>
         <w:spacing w:after="80" w:line="300" w:lineRule="auto"/>
         <w:ind w:left="540" w:hanging="271"/>
       </w:pPr>
+      <w:r>
+        <w:rPr>
+          <w:b/>
+        </w:rPr>
+        <w:t xml:space="preserve">3.  </w:t>
+      </w:r>
       <w:r>
         <w:t>Build a sorted classified-galaxy list by combining Peter Erwin and Victor Debattista revised classifications, excluding unknown classifications marked with '?'.</w:t>
       </w:r>
     </w:p>
     <w:p>
       <w:pPr>
-        <w:pStyle w:val="ListNumber"/>
         <w:spacing w:after="80" w:line="300" w:lineRule="auto"/>
         <w:ind w:left="540" w:hanging="271"/>
       </w:pPr>
+      <w:r>
+        <w:rPr>
+          <w:b/>
+        </w:rPr>
+        <w:t xml:space="preserve">4.  </w:t>
+      </w:r>
       <w:r>
         <w:t>For each classified galaxy, require a catalog row and manifest row, then construct a bar-major-axis profile from the FITS image.</w:t>
       </w:r>
     </w:p>
     <w:p>
       <w:pPr>
-        <w:pStyle w:val="ListNumber"/>
         <w:spacing w:after="80" w:line="300" w:lineRule="auto"/>
         <w:ind w:left="540" w:hanging="271"/>
       </w:pPr>
+      <w:r>
+        <w:rPr>
+          <w:b/>
+        </w:rPr>
+        <w:t xml:space="preserve">5.  </w:t>
+      </w:r>
       <w:r>
         <w:t>Write a missing-data text report and CSV for galaxies that cannot be analysed.</w:t>
       </w:r>
     </w:p>
     <w:p>
       <w:pPr>
-        <w:pStyle w:val="ListNumber"/>
         <w:spacing w:after="80" w:line="300" w:lineRule="auto"/>
         <w:ind w:left="540" w:hanging="271"/>
       </w:pPr>
+      <w:r>
+        <w:rPr>
+          <w:b/>
+        </w:rPr>
+        <w:t xml:space="preserve">6.  </w:t>
+      </w:r>
       <w:r>
         <w:t>Loop over all galaxies with usable profiles, interpolate NaNs, normalise the analysed profile, smooth it, calculate derivatives and radius of curvature, and search for left and right shoulder candidates.</w:t>
       </w:r>
     </w:p>
     <w:p>
       <w:pPr>
-        <w:pStyle w:val="ListNumber"/>
         <w:spacing w:after="80" w:line="300" w:lineRule="auto"/>
         <w:ind w:left="540" w:hanging="271"/>
       </w:pPr>
+      <w:r>
+        <w:rPr>
+          <w:b/>
+        </w:rPr>
+        <w:t xml:space="preserve">7.  </w:t>
+      </w:r>
       <w:r>
         <w:t>Reject shoulders that are too close to the centre, outside the bar, too thin, too steep, too noisy, one-sided when paired shoulders are required, or overlapping.</w:t>
       </w:r>
     </w:p>
     <w:p>
       <w:pPr>
-        <w:pStyle w:val="ListNumber"/>
         <w:spacing w:after="80" w:line="300" w:lineRule="auto"/>
         <w:ind w:left="540" w:hanging="271"/>
       </w:pPr>
+      <w:r>
+        <w:rPr>
+          <w:b/>
+        </w:rPr>
+        <w:t xml:space="preserve">8.  </w:t>
+      </w:r>
       <w:r>
         <w:t>Write final shoulder measurements in NPY and CSV formats, write shoulder_classifications.csv, and write a plain-text run summary.</w:t>
       </w:r>
     </w:p>
     <w:p>
       <w:pPr>
-        <w:pStyle w:val="ListNumber"/>
         <w:spacing w:after="80" w:line="300" w:lineRule="auto"/>
         <w:ind w:left="540" w:hanging="271"/>
       </w:pPr>
+      <w:r>
+        <w:rPr>
+          <w:b/>
+        </w:rPr>
+        <w:t xml:space="preserve">9.  </w:t>
+      </w:r>
       <w:r>
         <w:t>Optionally save one diagnostic PNG per analysed galaxy when --write-plots is supplied.</w:t>
       </w:r>
@@ -3756,6 +3844,530 @@
       </w:tr>
     </w:tbl>
     <w:p/>
+    <w:p>
+      <w:pPr>
+        <w:pStyle w:val="Heading2"/>
+      </w:pPr>
+      <w:r>
+        <w:t>Visual gallery command-line parameters</w:t>
+      </w:r>
+    </w:p>
+    <w:p>
+      <w:r>
+        <w:rPr>
+          <w:b w:val="0"/>
+        </w:rPr>
+        <w:t>Build Bar Profile Visual Gallery.py can be used either to write a static HTML file or to start the workbook-writing local server used by the batch launchers.</w:t>
+      </w:r>
+    </w:p>
+    <w:tbl>
+      <w:tblPr>
+        <w:tblStyle w:val="TableGrid"/>
+        <w:tblW w:type="dxa" w:w="9360"/>
+        <w:tblLayout w:type="fixed"/>
+        <w:tblLook w:firstColumn="1" w:firstRow="1" w:lastColumn="0" w:lastRow="0" w:noHBand="0" w:noVBand="1" w:val="04A0"/>
+        <w:jc w:val="left"/>
+        <w:tblInd w:w="120" w:type="dxa"/>
+      </w:tblPr>
+      <w:tblGrid>
+        <w:gridCol w:w="1800"/>
+        <w:gridCol w:w="2400"/>
+        <w:gridCol w:w="5160"/>
+      </w:tblGrid>
+      <w:tr>
+        <w:trPr>
+          <w:cantSplit/>
+          <w:tblHeader w:val="true"/>
+        </w:trPr>
+        <w:tc>
+          <w:tcPr>
+            <w:tcW w:type="dxa" w:w="1800"/>
+            <w:vAlign w:val="center"/>
+            <w:tcMar>
+              <w:top w:w="80" w:type="dxa"/>
+              <w:bottom w:w="80" w:type="dxa"/>
+              <w:start w:w="120" w:type="dxa"/>
+              <w:end w:w="120" w:type="dxa"/>
+            </w:tcMar>
+            <w:shd w:fill="E8EEF5"/>
+          </w:tcPr>
+          <w:p>
+            <w:r>
+              <w:rPr>
+                <w:b/>
+                <w:color w:val="1F4D78"/>
+              </w:rPr>
+              <w:t>Parameter</w:t>
+            </w:r>
+          </w:p>
+        </w:tc>
+        <w:tc>
+          <w:tcPr>
+            <w:tcW w:type="dxa" w:w="2400"/>
+            <w:vAlign w:val="center"/>
+            <w:tcMar>
+              <w:top w:w="80" w:type="dxa"/>
+              <w:bottom w:w="80" w:type="dxa"/>
+              <w:start w:w="120" w:type="dxa"/>
+              <w:end w:w="120" w:type="dxa"/>
+            </w:tcMar>
+            <w:shd w:fill="E8EEF5"/>
+          </w:tcPr>
+          <w:p>
+            <w:r>
+              <w:rPr>
+                <w:b/>
+                <w:color w:val="1F4D78"/>
+              </w:rPr>
+              <w:t>Default</w:t>
+            </w:r>
+          </w:p>
+        </w:tc>
+        <w:tc>
+          <w:tcPr>
+            <w:tcW w:type="dxa" w:w="5160"/>
+            <w:vAlign w:val="center"/>
+            <w:tcMar>
+              <w:top w:w="80" w:type="dxa"/>
+              <w:bottom w:w="80" w:type="dxa"/>
+              <w:start w:w="120" w:type="dxa"/>
+              <w:end w:w="120" w:type="dxa"/>
+            </w:tcMar>
+            <w:shd w:fill="E8EEF5"/>
+          </w:tcPr>
+          <w:p>
+            <w:r>
+              <w:rPr>
+                <w:b/>
+                <w:color w:val="1F4D78"/>
+              </w:rPr>
+              <w:t>Role</w:t>
+            </w:r>
+          </w:p>
+        </w:tc>
+      </w:tr>
+      <w:tr>
+        <w:trPr>
+          <w:cantSplit/>
+        </w:trPr>
+        <w:tc>
+          <w:tcPr>
+            <w:tcW w:type="dxa" w:w="1800"/>
+            <w:shd w:fill="F2F4F7"/>
+            <w:vAlign w:val="center"/>
+            <w:tcMar>
+              <w:top w:w="80" w:type="dxa"/>
+              <w:bottom w:w="80" w:type="dxa"/>
+              <w:start w:w="120" w:type="dxa"/>
+              <w:end w:w="120" w:type="dxa"/>
+            </w:tcMar>
+          </w:tcPr>
+          <w:p>
+            <w:r>
+              <w:rPr>
+                <w:b/>
+              </w:rPr>
+              <w:t>--pc</w:t>
+            </w:r>
+          </w:p>
+        </w:tc>
+        <w:tc>
+          <w:tcPr>
+            <w:tcW w:type="dxa" w:w="2400"/>
+            <w:vAlign w:val="center"/>
+            <w:tcMar>
+              <w:top w:w="80" w:type="dxa"/>
+              <w:bottom w:w="80" w:type="dxa"/>
+              <w:start w:w="120" w:type="dxa"/>
+              <w:end w:w="120" w:type="dxa"/>
+            </w:tcMar>
+          </w:tcPr>
+          <w:p>
+            <w:r>
+              <w:t>Laptop</w:t>
+            </w:r>
+          </w:p>
+        </w:tc>
+        <w:tc>
+          <w:tcPr>
+            <w:tcW w:type="dxa" w:w="5160"/>
+            <w:vAlign w:val="center"/>
+            <w:tcMar>
+              <w:top w:w="80" w:type="dxa"/>
+              <w:bottom w:w="80" w:type="dxa"/>
+              <w:start w:w="120" w:type="dxa"/>
+              <w:end w:w="120" w:type="dxa"/>
+            </w:tcMar>
+          </w:tcPr>
+          <w:p>
+            <w:r>
+              <w:t>Selects the Dropbox research-folder layout. Laptop maps to C:\Users\gordo\Dropbox\Public Documents\UCLAN\MSc Research; Desktop maps to D:\Dropbox\Public Documents\UCLAN\MSc Research.</w:t>
+            </w:r>
+          </w:p>
+        </w:tc>
+      </w:tr>
+      <w:tr>
+        <w:trPr>
+          <w:cantSplit/>
+        </w:trPr>
+        <w:tc>
+          <w:tcPr>
+            <w:tcW w:type="dxa" w:w="1800"/>
+            <w:shd w:fill="F2F4F7"/>
+            <w:vAlign w:val="center"/>
+            <w:tcMar>
+              <w:top w:w="80" w:type="dxa"/>
+              <w:bottom w:w="80" w:type="dxa"/>
+              <w:start w:w="120" w:type="dxa"/>
+              <w:end w:w="120" w:type="dxa"/>
+            </w:tcMar>
+          </w:tcPr>
+          <w:p>
+            <w:r>
+              <w:rPr>
+                <w:b/>
+              </w:rPr>
+              <w:t>--workbook</w:t>
+            </w:r>
+          </w:p>
+        </w:tc>
+        <w:tc>
+          <w:tcPr>
+            <w:tcW w:type="dxa" w:w="2400"/>
+            <w:vAlign w:val="center"/>
+            <w:tcMar>
+              <w:top w:w="80" w:type="dxa"/>
+              <w:bottom w:w="80" w:type="dxa"/>
+              <w:start w:w="120" w:type="dxa"/>
+              <w:end w:w="120" w:type="dxa"/>
+            </w:tcMar>
+          </w:tcPr>
+          <w:p>
+            <w:r>
+              <w:t>&lt;research_folder&gt;\Shoulder_Recognition_Erwin\PE_VPD_galaxy_classifications_with_definitions.xlsx</w:t>
+            </w:r>
+          </w:p>
+        </w:tc>
+        <w:tc>
+          <w:tcPr>
+            <w:tcW w:type="dxa" w:w="5160"/>
+            <w:vAlign w:val="center"/>
+            <w:tcMar>
+              <w:top w:w="80" w:type="dxa"/>
+              <w:bottom w:w="80" w:type="dxa"/>
+              <w:start w:w="120" w:type="dxa"/>
+              <w:end w:w="120" w:type="dxa"/>
+            </w:tcMar>
+          </w:tcPr>
+          <w:p>
+            <w:r>
+              <w:t>Optional explicit workbook path. Use this only when the workbook is not in the default Laptop/Desktop research-folder location.</w:t>
+            </w:r>
+          </w:p>
+        </w:tc>
+      </w:tr>
+      <w:tr>
+        <w:trPr>
+          <w:cantSplit/>
+        </w:trPr>
+        <w:tc>
+          <w:tcPr>
+            <w:tcW w:type="dxa" w:w="1800"/>
+            <w:shd w:fill="F2F4F7"/>
+            <w:vAlign w:val="center"/>
+            <w:tcMar>
+              <w:top w:w="80" w:type="dxa"/>
+              <w:bottom w:w="80" w:type="dxa"/>
+              <w:start w:w="120" w:type="dxa"/>
+              <w:end w:w="120" w:type="dxa"/>
+            </w:tcMar>
+          </w:tcPr>
+          <w:p>
+            <w:r>
+              <w:rPr>
+                <w:b/>
+              </w:rPr>
+              <w:t>--isophote-dir</w:t>
+            </w:r>
+          </w:p>
+        </w:tc>
+        <w:tc>
+          <w:tcPr>
+            <w:tcW w:type="dxa" w:w="2400"/>
+            <w:vAlign w:val="center"/>
+            <w:tcMar>
+              <w:top w:w="80" w:type="dxa"/>
+              <w:bottom w:w="80" w:type="dxa"/>
+              <w:start w:w="120" w:type="dxa"/>
+              <w:end w:w="120" w:type="dxa"/>
+            </w:tcMar>
+          </w:tcPr>
+          <w:p>
+            <w:r>
+              <w:t>&lt;research_folder&gt;\Erwin\isophote_output\individual</w:t>
+            </w:r>
+          </w:p>
+        </w:tc>
+        <w:tc>
+          <w:tcPr>
+            <w:tcW w:type="dxa" w:w="5160"/>
+            <w:vAlign w:val="center"/>
+            <w:tcMar>
+              <w:top w:w="80" w:type="dxa"/>
+              <w:bottom w:w="80" w:type="dxa"/>
+              <w:start w:w="120" w:type="dxa"/>
+              <w:end w:w="120" w:type="dxa"/>
+            </w:tcMar>
+          </w:tcPr>
+          <w:p>
+            <w:r>
+              <w:t>Optional explicit folder containing the individual &lt;galaxy&gt;_isophote_axes.pdf files shown in the gallery.</w:t>
+            </w:r>
+          </w:p>
+        </w:tc>
+      </w:tr>
+      <w:tr>
+        <w:trPr>
+          <w:cantSplit/>
+        </w:trPr>
+        <w:tc>
+          <w:tcPr>
+            <w:tcW w:type="dxa" w:w="1800"/>
+            <w:shd w:fill="F2F4F7"/>
+            <w:vAlign w:val="center"/>
+            <w:tcMar>
+              <w:top w:w="80" w:type="dxa"/>
+              <w:bottom w:w="80" w:type="dxa"/>
+              <w:start w:w="120" w:type="dxa"/>
+              <w:end w:w="120" w:type="dxa"/>
+            </w:tcMar>
+          </w:tcPr>
+          <w:p>
+            <w:r>
+              <w:rPr>
+                <w:b/>
+              </w:rPr>
+              <w:t>--output</w:t>
+            </w:r>
+          </w:p>
+        </w:tc>
+        <w:tc>
+          <w:tcPr>
+            <w:tcW w:type="dxa" w:w="2400"/>
+            <w:vAlign w:val="center"/>
+            <w:tcMar>
+              <w:top w:w="80" w:type="dxa"/>
+              <w:bottom w:w="80" w:type="dxa"/>
+              <w:start w:w="120" w:type="dxa"/>
+              <w:end w:w="120" w:type="dxa"/>
+            </w:tcMar>
+          </w:tcPr>
+          <w:p>
+            <w:r>
+              <w:t>&lt;research_folder&gt;\Shoulder_Recognition_Erwin\bar_profile_visual_gallery.html</w:t>
+            </w:r>
+          </w:p>
+        </w:tc>
+        <w:tc>
+          <w:tcPr>
+            <w:tcW w:type="dxa" w:w="5160"/>
+            <w:vAlign w:val="center"/>
+            <w:tcMar>
+              <w:top w:w="80" w:type="dxa"/>
+              <w:bottom w:w="80" w:type="dxa"/>
+              <w:start w:w="120" w:type="dxa"/>
+              <w:end w:w="120" w:type="dxa"/>
+            </w:tcMar>
+          </w:tcPr>
+          <w:p>
+            <w:r>
+              <w:t>Output path for the static HTML gallery when --serve is not supplied.</w:t>
+            </w:r>
+          </w:p>
+        </w:tc>
+      </w:tr>
+      <w:tr>
+        <w:trPr>
+          <w:cantSplit/>
+        </w:trPr>
+        <w:tc>
+          <w:tcPr>
+            <w:tcW w:type="dxa" w:w="1800"/>
+            <w:shd w:fill="F2F4F7"/>
+            <w:vAlign w:val="center"/>
+            <w:tcMar>
+              <w:top w:w="80" w:type="dxa"/>
+              <w:bottom w:w="80" w:type="dxa"/>
+              <w:start w:w="120" w:type="dxa"/>
+              <w:end w:w="120" w:type="dxa"/>
+            </w:tcMar>
+          </w:tcPr>
+          <w:p>
+            <w:r>
+              <w:rPr>
+                <w:b/>
+              </w:rPr>
+              <w:t>--serve</w:t>
+            </w:r>
+          </w:p>
+        </w:tc>
+        <w:tc>
+          <w:tcPr>
+            <w:tcW w:type="dxa" w:w="2400"/>
+            <w:vAlign w:val="center"/>
+            <w:tcMar>
+              <w:top w:w="80" w:type="dxa"/>
+              <w:bottom w:w="80" w:type="dxa"/>
+              <w:start w:w="120" w:type="dxa"/>
+              <w:end w:w="120" w:type="dxa"/>
+            </w:tcMar>
+          </w:tcPr>
+          <w:p>
+            <w:r>
+              <w:t>off</w:t>
+            </w:r>
+          </w:p>
+        </w:tc>
+        <w:tc>
+          <w:tcPr>
+            <w:tcW w:type="dxa" w:w="5160"/>
+            <w:vAlign w:val="center"/>
+            <w:tcMar>
+              <w:top w:w="80" w:type="dxa"/>
+              <w:bottom w:w="80" w:type="dxa"/>
+              <w:start w:w="120" w:type="dxa"/>
+              <w:end w:w="120" w:type="dxa"/>
+            </w:tcMar>
+          </w:tcPr>
+          <w:p>
+            <w:r>
+              <w:t>Starts a local HTTP server instead of writing only a static HTML file. In server mode, class and notes changes are saved directly into the workbook.</w:t>
+            </w:r>
+          </w:p>
+        </w:tc>
+      </w:tr>
+      <w:tr>
+        <w:trPr>
+          <w:cantSplit/>
+        </w:trPr>
+        <w:tc>
+          <w:tcPr>
+            <w:tcW w:type="dxa" w:w="1800"/>
+            <w:shd w:fill="F2F4F7"/>
+            <w:vAlign w:val="center"/>
+            <w:tcMar>
+              <w:top w:w="80" w:type="dxa"/>
+              <w:bottom w:w="80" w:type="dxa"/>
+              <w:start w:w="120" w:type="dxa"/>
+              <w:end w:w="120" w:type="dxa"/>
+            </w:tcMar>
+          </w:tcPr>
+          <w:p>
+            <w:r>
+              <w:rPr>
+                <w:b/>
+              </w:rPr>
+              <w:t>--host</w:t>
+            </w:r>
+          </w:p>
+        </w:tc>
+        <w:tc>
+          <w:tcPr>
+            <w:tcW w:type="dxa" w:w="2400"/>
+            <w:vAlign w:val="center"/>
+            <w:tcMar>
+              <w:top w:w="80" w:type="dxa"/>
+              <w:bottom w:w="80" w:type="dxa"/>
+              <w:start w:w="120" w:type="dxa"/>
+              <w:end w:w="120" w:type="dxa"/>
+            </w:tcMar>
+          </w:tcPr>
+          <w:p>
+            <w:r>
+              <w:t>127.0.0.1</w:t>
+            </w:r>
+          </w:p>
+        </w:tc>
+        <w:tc>
+          <w:tcPr>
+            <w:tcW w:type="dxa" w:w="5160"/>
+            <w:vAlign w:val="center"/>
+            <w:tcMar>
+              <w:top w:w="80" w:type="dxa"/>
+              <w:bottom w:w="80" w:type="dxa"/>
+              <w:start w:w="120" w:type="dxa"/>
+              <w:end w:w="120" w:type="dxa"/>
+            </w:tcMar>
+          </w:tcPr>
+          <w:p>
+            <w:r>
+              <w:t>Local network interface used by the server. Keep the default for normal single-PC use.</w:t>
+            </w:r>
+          </w:p>
+        </w:tc>
+      </w:tr>
+      <w:tr>
+        <w:trPr>
+          <w:cantSplit/>
+        </w:trPr>
+        <w:tc>
+          <w:tcPr>
+            <w:tcW w:type="dxa" w:w="1800"/>
+            <w:shd w:fill="F2F4F7"/>
+            <w:vAlign w:val="center"/>
+            <w:tcMar>
+              <w:top w:w="80" w:type="dxa"/>
+              <w:bottom w:w="80" w:type="dxa"/>
+              <w:start w:w="120" w:type="dxa"/>
+              <w:end w:w="120" w:type="dxa"/>
+            </w:tcMar>
+          </w:tcPr>
+          <w:p>
+            <w:r>
+              <w:rPr>
+                <w:b/>
+              </w:rPr>
+              <w:t>--port</w:t>
+            </w:r>
+          </w:p>
+        </w:tc>
+        <w:tc>
+          <w:tcPr>
+            <w:tcW w:type="dxa" w:w="2400"/>
+            <w:vAlign w:val="center"/>
+            <w:tcMar>
+              <w:top w:w="80" w:type="dxa"/>
+              <w:bottom w:w="80" w:type="dxa"/>
+              <w:start w:w="120" w:type="dxa"/>
+              <w:end w:w="120" w:type="dxa"/>
+            </w:tcMar>
+          </w:tcPr>
+          <w:p>
+            <w:r>
+              <w:t>8765</w:t>
+            </w:r>
+          </w:p>
+        </w:tc>
+        <w:tc>
+          <w:tcPr>
+            <w:tcW w:type="dxa" w:w="5160"/>
+            <w:vAlign w:val="center"/>
+            <w:tcMar>
+              <w:top w:w="80" w:type="dxa"/>
+              <w:bottom w:w="80" w:type="dxa"/>
+              <w:start w:w="120" w:type="dxa"/>
+              <w:end w:w="120" w:type="dxa"/>
+            </w:tcMar>
+          </w:tcPr>
+          <w:p>
+            <w:r>
+              <w:t>Port used by the server. The supplied Laptop and Desktop batch launchers override this to 8899, so the browser address is http://127.0.0.1:8899/.</w:t>
+            </w:r>
+          </w:p>
+        </w:tc>
+      </w:tr>
+    </w:tbl>
+    <w:p/>
     <w:tbl>
       <w:tblPr>
         <w:tblStyle w:val="TableGrid"/>
@@ -4281,7 +4893,7 @@
         <w:ind w:left="540" w:hanging="271"/>
       </w:pPr>
       <w:r>
-        <w:t>The Laptop launcher starts the server on http://127.0.0.1:8899/ and uses the Laptop Dropbox research-folder path.</w:t>
+        <w:t>The Laptop and Desktop launchers start the server on http://127.0.0.1:8899/ and select the corresponding Dropbox research-folder path.</w:t>
       </w:r>
     </w:p>
     <w:p>
@@ -4294,40 +4906,75 @@
     </w:p>
     <w:p>
       <w:pPr>
-        <w:pStyle w:val="ListNumber"/>
         <w:spacing w:after="80" w:line="300" w:lineRule="auto"/>
         <w:ind w:left="540" w:hanging="271"/>
       </w:pPr>
+      <w:r>
+        <w:rPr>
+          <w:b/>
+        </w:rPr>
+        <w:t xml:space="preserve">1.  </w:t>
+      </w:r>
       <w:r>
         <w:t>Open PowerShell in C:\Users\gordo\Documents\GitHub\PythonScripts.</w:t>
       </w:r>
     </w:p>
     <w:p>
       <w:pPr>
-        <w:pStyle w:val="ListNumber"/>
         <w:spacing w:after="80" w:line="300" w:lineRule="auto"/>
         <w:ind w:left="540" w:hanging="271"/>
       </w:pPr>
       <w:r>
-        <w:t>Run: &amp; "C:\Users\gordo\Documents\GitHub\PythonScripts\Shoulder Recognition Erwin\Run Bar Profile Visual Gallery Server Laptop.bat"</w:t>
+        <w:rPr>
+          <w:b/>
+        </w:rPr>
+        <w:t xml:space="preserve">2.  </w:t>
+      </w:r>
+      <w:r>
+        <w:t>For the Laptop path, run: &amp; "C:\Users\gordo\Documents\GitHub\PythonScripts\Shoulder Recognition Erwin\Run Bar Profile Visual Gallery Server Laptop.bat"</w:t>
       </w:r>
     </w:p>
     <w:p>
       <w:pPr>
-        <w:pStyle w:val="ListNumber"/>
         <w:spacing w:after="80" w:line="300" w:lineRule="auto"/>
         <w:ind w:left="540" w:hanging="271"/>
       </w:pPr>
+      <w:r>
+        <w:rPr>
+          <w:b/>
+        </w:rPr>
+        <w:t xml:space="preserve">3.  </w:t>
+      </w:r>
+      <w:r>
+        <w:t>For the Desktop path, run: &amp; "C:\Users\gordo\Documents\GitHub\PythonScripts\Shoulder Recognition Erwin\Run Bar Profile Visual Gallery Server Desktop.bat"</w:t>
+      </w:r>
+    </w:p>
+    <w:p>
+      <w:pPr>
+        <w:spacing w:after="80" w:line="300" w:lineRule="auto"/>
+        <w:ind w:left="540" w:hanging="271"/>
+      </w:pPr>
+      <w:r>
+        <w:rPr>
+          <w:b/>
+        </w:rPr>
+        <w:t xml:space="preserve">4.  </w:t>
+      </w:r>
       <w:r>
         <w:t>Open http://127.0.0.1:8899/ in the browser.</w:t>
       </w:r>
     </w:p>
     <w:p>
       <w:pPr>
-        <w:pStyle w:val="ListNumber"/>
         <w:spacing w:after="80" w:line="300" w:lineRule="auto"/>
         <w:ind w:left="540" w:hanging="271"/>
       </w:pPr>
+      <w:r>
+        <w:rPr>
+          <w:b/>
+        </w:rPr>
+        <w:t xml:space="preserve">5.  </w:t>
+      </w:r>
       <w:r>
         <w:t>Check that the page header shows v2026-06-25 hide-all. If an older page appears, restart the batch file and refresh with Ctrl+F5.</w:t>
       </w:r>
@@ -4342,60 +4989,90 @@
     </w:p>
     <w:p>
       <w:pPr>
-        <w:pStyle w:val="ListNumber"/>
         <w:spacing w:after="80" w:line="300" w:lineRule="auto"/>
         <w:ind w:left="540" w:hanging="271"/>
       </w:pPr>
+      <w:r>
+        <w:rPr>
+          <w:b/>
+        </w:rPr>
+        <w:t xml:space="preserve">1.  </w:t>
+      </w:r>
       <w:r>
         <w:t>Keep Reveal Classifiers off for a blind visual pass. With the switch off, PE, VPD, and SRA are hidden for every galaxy.</w:t>
       </w:r>
     </w:p>
     <w:p>
       <w:pPr>
-        <w:pStyle w:val="ListNumber"/>
         <w:spacing w:after="80" w:line="300" w:lineRule="auto"/>
         <w:ind w:left="540" w:hanging="271"/>
       </w:pPr>
+      <w:r>
+        <w:rPr>
+          <w:b/>
+        </w:rPr>
+        <w:t xml:space="preserve">2.  </w:t>
+      </w:r>
       <w:r>
         <w:t>Inspect the right-hand major-axis bar-profile plot in the embedded isophote PDF. Use Open PDF if the embedded view is too small.</w:t>
       </w:r>
     </w:p>
     <w:p>
       <w:pPr>
-        <w:pStyle w:val="ListNumber"/>
         <w:spacing w:after="80" w:line="300" w:lineRule="auto"/>
         <w:ind w:left="540" w:hanging="271"/>
       </w:pPr>
+      <w:r>
+        <w:rPr>
+          <w:b/>
+        </w:rPr>
+        <w:t xml:space="preserve">3.  </w:t>
+      </w:r>
       <w:r>
         <w:t>Use the classification picker to select Peak+Sh, Exp, Flat-top (FT), Two-slope (2S), or Unclear.</w:t>
       </w:r>
     </w:p>
     <w:p>
       <w:pPr>
-        <w:pStyle w:val="ListNumber"/>
         <w:spacing w:after="80" w:line="300" w:lineRule="auto"/>
         <w:ind w:left="540" w:hanging="271"/>
       </w:pPr>
+      <w:r>
+        <w:rPr>
+          <w:b/>
+        </w:rPr>
+        <w:t xml:space="preserve">4.  </w:t>
+      </w:r>
       <w:r>
         <w:t>Add any comments in the Notes field.</w:t>
       </w:r>
     </w:p>
     <w:p>
       <w:pPr>
-        <w:pStyle w:val="ListNumber"/>
         <w:spacing w:after="80" w:line="300" w:lineRule="auto"/>
         <w:ind w:left="540" w:hanging="271"/>
       </w:pPr>
+      <w:r>
+        <w:rPr>
+          <w:b/>
+        </w:rPr>
+        <w:t xml:space="preserve">5.  </w:t>
+      </w:r>
       <w:r>
         <w:t>Wait for the page to show Saved to workbook. The selected class is written to GB visual class and the notes are written to GB visual notes in the workbook.</w:t>
       </w:r>
     </w:p>
     <w:p>
       <w:pPr>
-        <w:pStyle w:val="ListNumber"/>
         <w:spacing w:after="80" w:line="300" w:lineRule="auto"/>
         <w:ind w:left="540" w:hanging="271"/>
       </w:pPr>
+      <w:r>
+        <w:rPr>
+          <w:b/>
+        </w:rPr>
+        <w:t xml:space="preserve">6.  </w:t>
+      </w:r>
       <w:r>
         <w:t>Use Export CSV as an optional browser-side backup of the visual classifications.</w:t>
       </w:r>

</xml_diff>